<commit_message>
Update guarantee framework with actual document content
- Replace placeholder docx files in public/ with the real Word documents
- Rewrite guarantee framework prose on /research page to match the actual article: direction-first framing, sovereign ceiling mechanics, EGPC arrears as poor-tier reference case, correct AfDB samurai partial-vs-full substitution caveat, accurate 9-factor checklist summary

Co-Authored-By: Claude Sonnet 4.6 <noreply@anthropic.com>
</commit_message>
<xml_diff>
--- a/public/egypt-guarantee-checklist.docx
+++ b/public/egypt-guarantee-checklist.docx
@@ -20,6 +20,9 @@
     </w:p>
     <w:p>
       <w:pPr>
+        <w:pBdr>
+          <w:bottom w:val="single" w:sz="6" w:space="8" w:color="2E5395"/>
+        </w:pBdr>
         <w:spacing w:after="300"/>
       </w:pPr>
       <w:r>
@@ -44,67 +47,13 @@
           <w:sz w:val="22"/>
           <w:szCs w:val="22"/>
         </w:rPr>
-        <w:t xml:space="preserve">A rating or a headline “government guaranteed” label tells you almost nothing on its own. This checklist sets out what </w:t>
-      </w:r>
-      <w:proofErr w:type="gramStart"/>
-      <w:r>
-        <w:rPr>
-          <w:rFonts w:ascii="Calibri" w:eastAsia="Calibri" w:hAnsi="Calibri" w:cs="Calibri"/>
-          <w:sz w:val="22"/>
-          <w:szCs w:val="22"/>
-        </w:rPr>
-        <w:t>actually determines</w:t>
-      </w:r>
-      <w:proofErr w:type="gramEnd"/>
-      <w:r>
-        <w:rPr>
-          <w:rFonts w:ascii="Calibri" w:eastAsia="Calibri" w:hAnsi="Calibri" w:cs="Calibri"/>
-          <w:sz w:val="22"/>
-          <w:szCs w:val="22"/>
-        </w:rPr>
-        <w:t xml:space="preserve"> whether a guarantee transfers meaningful credit protection to a </w:t>
-      </w:r>
-      <w:proofErr w:type="gramStart"/>
-      <w:r>
-        <w:rPr>
-          <w:rFonts w:ascii="Calibri" w:eastAsia="Calibri" w:hAnsi="Calibri" w:cs="Calibri"/>
-          <w:sz w:val="22"/>
-          <w:szCs w:val="22"/>
-        </w:rPr>
-        <w:t>bondholder, or</w:t>
-      </w:r>
-      <w:proofErr w:type="gramEnd"/>
-      <w:r>
-        <w:rPr>
-          <w:rFonts w:ascii="Calibri" w:eastAsia="Calibri" w:hAnsi="Calibri" w:cs="Calibri"/>
-          <w:sz w:val="22"/>
-          <w:szCs w:val="22"/>
-        </w:rPr>
-        <w:t xml:space="preserve"> just repackages the same risk with a reassuring label attached, followed by a poor-to-strong scale for placing a given instrument on that spectrum. It is built to be used directly against a specific bond's </w:t>
-      </w:r>
-      <w:proofErr w:type="gramStart"/>
-      <w:r>
-        <w:rPr>
-          <w:rFonts w:ascii="Calibri" w:eastAsia="Calibri" w:hAnsi="Calibri" w:cs="Calibri"/>
-          <w:sz w:val="22"/>
-          <w:szCs w:val="22"/>
-        </w:rPr>
-        <w:t>documentation, and</w:t>
-      </w:r>
-      <w:proofErr w:type="gramEnd"/>
-      <w:r>
-        <w:rPr>
-          <w:rFonts w:ascii="Calibri" w:eastAsia="Calibri" w:hAnsi="Calibri" w:cs="Calibri"/>
-          <w:sz w:val="22"/>
-          <w:szCs w:val="22"/>
-        </w:rPr>
-        <w:t xml:space="preserve"> is referenced throughout the companion piece on pricing Egyptian quasi-sovereign issuance.</w:t>
+        <w:t>A rating or a headline “government guaranteed” label tells you almost nothing on its own. This checklist sets out what actually determines whether a guarantee transfers meaningful credit protection to a bondholder, or just repackages the same risk with a reassuring label attached, followed by a poor-to-strong scale for placing a given instrument on that spectrum. It is built to be used directly against a specific bond's documentation, and is referenced throughout the companion piece on pricing Egyptian quasi-sovereign issuance.</w:t>
       </w:r>
     </w:p>
     <w:p>
       <w:pPr>
         <w:pStyle w:val="Heading1"/>
-        <w:spacing w:before="360" w:after="160"/>
+        <w:spacing w:before="120" w:after="160"/>
       </w:pPr>
       <w:r>
         <w:rPr>
@@ -115,6 +64,1053 @@
           <w:sz w:val="26"/>
           <w:szCs w:val="26"/>
         </w:rPr>
+        <w:t>Quick-reference scorecard</w:t>
+      </w:r>
+    </w:p>
+    <w:p>
+      <w:pPr>
+        <w:spacing w:after="160" w:line="276" w:lineRule="auto"/>
+      </w:pPr>
+      <w:r>
+        <w:rPr>
+          <w:rFonts w:ascii="Calibri" w:eastAsia="Calibri" w:hAnsi="Calibri" w:cs="Calibri"/>
+          <w:sz w:val="22"/>
+          <w:szCs w:val="22"/>
+        </w:rPr>
+        <w:t>A compressed version of the full checklist, for scoring a specific instrument quickly. The detailed sections that follow give the reasoning behind each cell and should be consulted whenever a factor is ambiguous – this table is a starting point, not a substitute for reading the documentation.</w:t>
+      </w:r>
+    </w:p>
+    <w:tbl>
+      <w:tblPr>
+        <w:tblW w:w="9360" w:type="dxa"/>
+        <w:tblBorders>
+          <w:top w:val="single" w:sz="4" w:space="0" w:color="BFBFBF"/>
+          <w:left w:val="single" w:sz="4" w:space="0" w:color="BFBFBF"/>
+          <w:bottom w:val="single" w:sz="4" w:space="0" w:color="BFBFBF"/>
+          <w:right w:val="single" w:sz="4" w:space="0" w:color="BFBFBF"/>
+          <w:insideH w:val="single" w:sz="4" w:space="0" w:color="BFBFBF"/>
+          <w:insideV w:val="single" w:sz="4" w:space="0" w:color="BFBFBF"/>
+        </w:tblBorders>
+        <w:tblLook w:val="0000" w:firstRow="0" w:lastRow="0" w:firstColumn="0" w:lastColumn="0" w:noHBand="0" w:noVBand="0"/>
+      </w:tblPr>
+      <w:tblGrid>
+        <w:gridCol w:w="2200"/>
+        <w:gridCol w:w="2387"/>
+        <w:gridCol w:w="2387"/>
+        <w:gridCol w:w="2386"/>
+      </w:tblGrid>
+      <w:tr>
+        <w:trPr>
+          <w:cantSplit/>
+        </w:trPr>
+        <w:tc>
+          <w:tcPr>
+            <w:tcW w:w="2200" w:type="dxa"/>
+            <w:shd w:val="clear" w:color="auto" w:fill="1F3864"/>
+            <w:tcMar>
+              <w:top w:w="80" w:type="dxa"/>
+              <w:left w:w="120" w:type="dxa"/>
+              <w:bottom w:w="80" w:type="dxa"/>
+              <w:right w:w="120" w:type="dxa"/>
+            </w:tcMar>
+          </w:tcPr>
+          <w:p>
+            <w:r>
+              <w:rPr>
+                <w:rFonts w:ascii="Calibri" w:hAnsi="Calibri"/>
+                <w:b/>
+                <w:color w:val="FFFFFF"/>
+                <w:sz w:val="19"/>
+              </w:rPr>
+              <w:t>Factor</w:t>
+            </w:r>
+          </w:p>
+        </w:tc>
+        <w:tc>
+          <w:tcPr>
+            <w:tcW w:w="2387" w:type="dxa"/>
+            <w:shd w:val="clear" w:color="auto" w:fill="1F3864"/>
+            <w:tcMar>
+              <w:top w:w="80" w:type="dxa"/>
+              <w:left w:w="120" w:type="dxa"/>
+              <w:bottom w:w="80" w:type="dxa"/>
+              <w:right w:w="120" w:type="dxa"/>
+            </w:tcMar>
+          </w:tcPr>
+          <w:p>
+            <w:r>
+              <w:rPr>
+                <w:rFonts w:ascii="Calibri" w:hAnsi="Calibri"/>
+                <w:b/>
+                <w:color w:val="FFFFFF"/>
+                <w:sz w:val="19"/>
+              </w:rPr>
+              <w:t>Poor</w:t>
+            </w:r>
+          </w:p>
+        </w:tc>
+        <w:tc>
+          <w:tcPr>
+            <w:tcW w:w="2387" w:type="dxa"/>
+            <w:shd w:val="clear" w:color="auto" w:fill="1F3864"/>
+            <w:tcMar>
+              <w:top w:w="80" w:type="dxa"/>
+              <w:left w:w="120" w:type="dxa"/>
+              <w:bottom w:w="80" w:type="dxa"/>
+              <w:right w:w="120" w:type="dxa"/>
+            </w:tcMar>
+          </w:tcPr>
+          <w:p>
+            <w:r>
+              <w:rPr>
+                <w:rFonts w:ascii="Calibri" w:hAnsi="Calibri"/>
+                <w:b/>
+                <w:color w:val="FFFFFF"/>
+                <w:sz w:val="19"/>
+              </w:rPr>
+              <w:t>Moderate</w:t>
+            </w:r>
+          </w:p>
+        </w:tc>
+        <w:tc>
+          <w:tcPr>
+            <w:tcW w:w="2386" w:type="dxa"/>
+            <w:shd w:val="clear" w:color="auto" w:fill="1F3864"/>
+            <w:tcMar>
+              <w:top w:w="80" w:type="dxa"/>
+              <w:left w:w="120" w:type="dxa"/>
+              <w:bottom w:w="80" w:type="dxa"/>
+              <w:right w:w="120" w:type="dxa"/>
+            </w:tcMar>
+          </w:tcPr>
+          <w:p>
+            <w:r>
+              <w:rPr>
+                <w:rFonts w:ascii="Calibri" w:hAnsi="Calibri"/>
+                <w:b/>
+                <w:color w:val="FFFFFF"/>
+                <w:sz w:val="19"/>
+              </w:rPr>
+              <w:t>Strong</w:t>
+            </w:r>
+          </w:p>
+        </w:tc>
+      </w:tr>
+      <w:tr>
+        <w:trPr>
+          <w:cantSplit/>
+        </w:trPr>
+        <w:tc>
+          <w:tcPr>
+            <w:tcW w:w="2200" w:type="dxa"/>
+            <w:tcMar>
+              <w:top w:w="80" w:type="dxa"/>
+              <w:left w:w="120" w:type="dxa"/>
+              <w:bottom w:w="80" w:type="dxa"/>
+              <w:right w:w="120" w:type="dxa"/>
+            </w:tcMar>
+          </w:tcPr>
+          <w:p>
+            <w:r>
+              <w:rPr>
+                <w:rFonts w:ascii="Calibri" w:hAnsi="Calibri"/>
+                <w:b/>
+                <w:sz w:val="18"/>
+              </w:rPr>
+              <w:t>1. Explicit vs implicit</w:t>
+            </w:r>
+          </w:p>
+        </w:tc>
+        <w:tc>
+          <w:tcPr>
+            <w:tcW w:w="2387" w:type="dxa"/>
+            <w:shd w:val="clear" w:color="auto" w:fill="FCE4E4"/>
+            <w:tcMar>
+              <w:top w:w="80" w:type="dxa"/>
+              <w:left w:w="120" w:type="dxa"/>
+              <w:bottom w:w="80" w:type="dxa"/>
+              <w:right w:w="120" w:type="dxa"/>
+            </w:tcMar>
+          </w:tcPr>
+          <w:p>
+            <w:r>
+              <w:rPr>
+                <w:rFonts w:ascii="Calibri" w:hAnsi="Calibri"/>
+                <w:sz w:val="18"/>
+              </w:rPr>
+              <w:t>Implicit only, or a non-binding comfort letter</w:t>
+            </w:r>
+          </w:p>
+        </w:tc>
+        <w:tc>
+          <w:tcPr>
+            <w:tcW w:w="2387" w:type="dxa"/>
+            <w:shd w:val="clear" w:color="auto" w:fill="FFF2CC"/>
+            <w:tcMar>
+              <w:top w:w="80" w:type="dxa"/>
+              <w:left w:w="120" w:type="dxa"/>
+              <w:bottom w:w="80" w:type="dxa"/>
+              <w:right w:w="120" w:type="dxa"/>
+            </w:tcMar>
+          </w:tcPr>
+          <w:p>
+            <w:r>
+              <w:rPr>
+                <w:rFonts w:ascii="Calibri" w:hAnsi="Calibri"/>
+                <w:sz w:val="18"/>
+              </w:rPr>
+              <w:t>Explicit, but embedded in the bond’s own terms rather than standalone</w:t>
+            </w:r>
+          </w:p>
+        </w:tc>
+        <w:tc>
+          <w:tcPr>
+            <w:tcW w:w="2386" w:type="dxa"/>
+            <w:shd w:val="clear" w:color="auto" w:fill="E2EFDA"/>
+            <w:tcMar>
+              <w:top w:w="80" w:type="dxa"/>
+              <w:left w:w="120" w:type="dxa"/>
+              <w:bottom w:w="80" w:type="dxa"/>
+              <w:right w:w="120" w:type="dxa"/>
+            </w:tcMar>
+          </w:tcPr>
+          <w:p>
+            <w:r>
+              <w:rPr>
+                <w:rFonts w:ascii="Calibri" w:hAnsi="Calibri"/>
+                <w:sz w:val="18"/>
+              </w:rPr>
+              <w:t>Explicit, standalone guarantee instrument</w:t>
+            </w:r>
+          </w:p>
+        </w:tc>
+      </w:tr>
+      <w:tr>
+        <w:trPr>
+          <w:cantSplit/>
+        </w:trPr>
+        <w:tc>
+          <w:tcPr>
+            <w:tcW w:w="2200" w:type="dxa"/>
+            <w:tcMar>
+              <w:top w:w="80" w:type="dxa"/>
+              <w:left w:w="120" w:type="dxa"/>
+              <w:bottom w:w="80" w:type="dxa"/>
+              <w:right w:w="120" w:type="dxa"/>
+            </w:tcMar>
+          </w:tcPr>
+          <w:p>
+            <w:r>
+              <w:rPr>
+                <w:rFonts w:ascii="Calibri" w:hAnsi="Calibri"/>
+                <w:b/>
+                <w:sz w:val="18"/>
+              </w:rPr>
+              <w:t>2. Governing law &amp; payment standard</w:t>
+            </w:r>
+          </w:p>
+        </w:tc>
+        <w:tc>
+          <w:tcPr>
+            <w:tcW w:w="2387" w:type="dxa"/>
+            <w:shd w:val="clear" w:color="auto" w:fill="FCE4E4"/>
+            <w:tcMar>
+              <w:top w:w="80" w:type="dxa"/>
+              <w:left w:w="120" w:type="dxa"/>
+              <w:bottom w:w="80" w:type="dxa"/>
+              <w:right w:w="120" w:type="dxa"/>
+            </w:tcMar>
+          </w:tcPr>
+          <w:p>
+            <w:r>
+              <w:rPr>
+                <w:rFonts w:ascii="Calibri" w:hAnsi="Calibri"/>
+                <w:sz w:val="18"/>
+              </w:rPr>
+              <w:t>Local law; guarantee of collection</w:t>
+            </w:r>
+          </w:p>
+        </w:tc>
+        <w:tc>
+          <w:tcPr>
+            <w:tcW w:w="2387" w:type="dxa"/>
+            <w:shd w:val="clear" w:color="auto" w:fill="FFF2CC"/>
+            <w:tcMar>
+              <w:top w:w="80" w:type="dxa"/>
+              <w:left w:w="120" w:type="dxa"/>
+              <w:bottom w:w="80" w:type="dxa"/>
+              <w:right w:w="120" w:type="dxa"/>
+            </w:tcMar>
+          </w:tcPr>
+          <w:p>
+            <w:r>
+              <w:rPr>
+                <w:rFonts w:ascii="Calibri" w:hAnsi="Calibri"/>
+                <w:sz w:val="18"/>
+              </w:rPr>
+              <w:t>Local law with procedural protections, or foreign law with a collection standard</w:t>
+            </w:r>
+          </w:p>
+        </w:tc>
+        <w:tc>
+          <w:tcPr>
+            <w:tcW w:w="2386" w:type="dxa"/>
+            <w:shd w:val="clear" w:color="auto" w:fill="E2EFDA"/>
+            <w:tcMar>
+              <w:top w:w="80" w:type="dxa"/>
+              <w:left w:w="120" w:type="dxa"/>
+              <w:bottom w:w="80" w:type="dxa"/>
+              <w:right w:w="120" w:type="dxa"/>
+            </w:tcMar>
+          </w:tcPr>
+          <w:p>
+            <w:r>
+              <w:rPr>
+                <w:rFonts w:ascii="Calibri" w:hAnsi="Calibri"/>
+                <w:sz w:val="18"/>
+              </w:rPr>
+              <w:t>Foreign or multilateral-governed; guarantee of payment, automatic trigger</w:t>
+            </w:r>
+          </w:p>
+        </w:tc>
+      </w:tr>
+      <w:tr>
+        <w:trPr>
+          <w:cantSplit/>
+        </w:trPr>
+        <w:tc>
+          <w:tcPr>
+            <w:tcW w:w="2200" w:type="dxa"/>
+            <w:tcMar>
+              <w:top w:w="80" w:type="dxa"/>
+              <w:left w:w="120" w:type="dxa"/>
+              <w:bottom w:w="80" w:type="dxa"/>
+              <w:right w:w="120" w:type="dxa"/>
+            </w:tcMar>
+          </w:tcPr>
+          <w:p>
+            <w:r>
+              <w:rPr>
+                <w:rFonts w:ascii="Calibri" w:hAnsi="Calibri"/>
+                <w:b/>
+                <w:sz w:val="18"/>
+              </w:rPr>
+              <w:t>3. Immunity waiver</w:t>
+            </w:r>
+          </w:p>
+        </w:tc>
+        <w:tc>
+          <w:tcPr>
+            <w:tcW w:w="2387" w:type="dxa"/>
+            <w:shd w:val="clear" w:color="auto" w:fill="FCE4E4"/>
+            <w:tcMar>
+              <w:top w:w="80" w:type="dxa"/>
+              <w:left w:w="120" w:type="dxa"/>
+              <w:bottom w:w="80" w:type="dxa"/>
+              <w:right w:w="120" w:type="dxa"/>
+            </w:tcMar>
+          </w:tcPr>
+          <w:p>
+            <w:r>
+              <w:rPr>
+                <w:rFonts w:ascii="Calibri" w:hAnsi="Calibri"/>
+                <w:sz w:val="18"/>
+              </w:rPr>
+              <w:t>None, or suit only (execution immunity retained)</w:t>
+            </w:r>
+          </w:p>
+        </w:tc>
+        <w:tc>
+          <w:tcPr>
+            <w:tcW w:w="2387" w:type="dxa"/>
+            <w:shd w:val="clear" w:color="auto" w:fill="FFF2CC"/>
+            <w:tcMar>
+              <w:top w:w="80" w:type="dxa"/>
+              <w:left w:w="120" w:type="dxa"/>
+              <w:bottom w:w="80" w:type="dxa"/>
+              <w:right w:w="120" w:type="dxa"/>
+            </w:tcMar>
+          </w:tcPr>
+          <w:p>
+            <w:r>
+              <w:rPr>
+                <w:rFonts w:ascii="Calibri" w:hAnsi="Calibri"/>
+                <w:sz w:val="18"/>
+              </w:rPr>
+              <w:t>Partial waiver, untested in litigation</w:t>
+            </w:r>
+          </w:p>
+        </w:tc>
+        <w:tc>
+          <w:tcPr>
+            <w:tcW w:w="2386" w:type="dxa"/>
+            <w:shd w:val="clear" w:color="auto" w:fill="E2EFDA"/>
+            <w:tcMar>
+              <w:top w:w="80" w:type="dxa"/>
+              <w:left w:w="120" w:type="dxa"/>
+              <w:bottom w:w="80" w:type="dxa"/>
+              <w:right w:w="120" w:type="dxa"/>
+            </w:tcMar>
+          </w:tcPr>
+          <w:p>
+            <w:r>
+              <w:rPr>
+                <w:rFonts w:ascii="Calibri" w:hAnsi="Calibri"/>
+                <w:sz w:val="18"/>
+              </w:rPr>
+              <w:t>Full waiver (suit and execution), ideally tested precedent</w:t>
+            </w:r>
+          </w:p>
+        </w:tc>
+      </w:tr>
+      <w:tr>
+        <w:trPr>
+          <w:cantSplit/>
+        </w:trPr>
+        <w:tc>
+          <w:tcPr>
+            <w:tcW w:w="2200" w:type="dxa"/>
+            <w:tcMar>
+              <w:top w:w="80" w:type="dxa"/>
+              <w:left w:w="120" w:type="dxa"/>
+              <w:bottom w:w="80" w:type="dxa"/>
+              <w:right w:w="120" w:type="dxa"/>
+            </w:tcMar>
+          </w:tcPr>
+          <w:p>
+            <w:r>
+              <w:rPr>
+                <w:rFonts w:ascii="Calibri" w:hAnsi="Calibri"/>
+                <w:b/>
+                <w:sz w:val="18"/>
+              </w:rPr>
+              <w:t>4. Guarantee scope</w:t>
+            </w:r>
+          </w:p>
+        </w:tc>
+        <w:tc>
+          <w:tcPr>
+            <w:tcW w:w="2387" w:type="dxa"/>
+            <w:shd w:val="clear" w:color="auto" w:fill="FCE4E4"/>
+            <w:tcMar>
+              <w:top w:w="80" w:type="dxa"/>
+              <w:left w:w="120" w:type="dxa"/>
+              <w:bottom w:w="80" w:type="dxa"/>
+              <w:right w:w="120" w:type="dxa"/>
+            </w:tcMar>
+          </w:tcPr>
+          <w:p>
+            <w:r>
+              <w:rPr>
+                <w:rFonts w:ascii="Calibri" w:hAnsi="Calibri"/>
+                <w:sz w:val="18"/>
+              </w:rPr>
+              <w:t>Undefined or purely implicit</w:t>
+            </w:r>
+          </w:p>
+        </w:tc>
+        <w:tc>
+          <w:tcPr>
+            <w:tcW w:w="2387" w:type="dxa"/>
+            <w:shd w:val="clear" w:color="auto" w:fill="FFF2CC"/>
+            <w:tcMar>
+              <w:top w:w="80" w:type="dxa"/>
+              <w:left w:w="120" w:type="dxa"/>
+              <w:bottom w:w="80" w:type="dxa"/>
+              <w:right w:w="120" w:type="dxa"/>
+            </w:tcMar>
+          </w:tcPr>
+          <w:p>
+            <w:r>
+              <w:rPr>
+                <w:rFonts w:ascii="Calibri" w:hAnsi="Calibri"/>
+                <w:sz w:val="18"/>
+              </w:rPr>
+              <w:t>Principal only, or conditional / partial coverage</w:t>
+            </w:r>
+          </w:p>
+        </w:tc>
+        <w:tc>
+          <w:tcPr>
+            <w:tcW w:w="2386" w:type="dxa"/>
+            <w:shd w:val="clear" w:color="auto" w:fill="E2EFDA"/>
+            <w:tcMar>
+              <w:top w:w="80" w:type="dxa"/>
+              <w:left w:w="120" w:type="dxa"/>
+              <w:bottom w:w="80" w:type="dxa"/>
+              <w:right w:w="120" w:type="dxa"/>
+            </w:tcMar>
+          </w:tcPr>
+          <w:p>
+            <w:r>
+              <w:rPr>
+                <w:rFonts w:ascii="Calibri" w:hAnsi="Calibri"/>
+                <w:sz w:val="18"/>
+              </w:rPr>
+              <w:t>Principal plus coupon, unconditional, or a well-structured PCG</w:t>
+            </w:r>
+          </w:p>
+        </w:tc>
+      </w:tr>
+      <w:tr>
+        <w:trPr>
+          <w:cantSplit/>
+        </w:trPr>
+        <w:tc>
+          <w:tcPr>
+            <w:tcW w:w="2200" w:type="dxa"/>
+            <w:tcMar>
+              <w:top w:w="80" w:type="dxa"/>
+              <w:left w:w="120" w:type="dxa"/>
+              <w:bottom w:w="80" w:type="dxa"/>
+              <w:right w:w="120" w:type="dxa"/>
+            </w:tcMar>
+          </w:tcPr>
+          <w:p>
+            <w:r>
+              <w:rPr>
+                <w:rFonts w:ascii="Calibri" w:hAnsi="Calibri"/>
+                <w:b/>
+                <w:sz w:val="18"/>
+              </w:rPr>
+              <w:t>5. Payment mechanism</w:t>
+            </w:r>
+          </w:p>
+        </w:tc>
+        <w:tc>
+          <w:tcPr>
+            <w:tcW w:w="2387" w:type="dxa"/>
+            <w:shd w:val="clear" w:color="auto" w:fill="FCE4E4"/>
+            <w:tcMar>
+              <w:top w:w="80" w:type="dxa"/>
+              <w:left w:w="120" w:type="dxa"/>
+              <w:bottom w:w="80" w:type="dxa"/>
+              <w:right w:w="120" w:type="dxa"/>
+            </w:tcMar>
+          </w:tcPr>
+          <w:p>
+            <w:r>
+              <w:rPr>
+                <w:rFonts w:ascii="Calibri" w:hAnsi="Calibri"/>
+                <w:sz w:val="18"/>
+              </w:rPr>
+              <w:t>Routed through a domestic ministry or agency</w:t>
+            </w:r>
+          </w:p>
+        </w:tc>
+        <w:tc>
+          <w:tcPr>
+            <w:tcW w:w="2387" w:type="dxa"/>
+            <w:shd w:val="clear" w:color="auto" w:fill="FFF2CC"/>
+            <w:tcMar>
+              <w:top w:w="80" w:type="dxa"/>
+              <w:left w:w="120" w:type="dxa"/>
+              <w:bottom w:w="80" w:type="dxa"/>
+              <w:right w:w="120" w:type="dxa"/>
+            </w:tcMar>
+          </w:tcPr>
+          <w:p>
+            <w:r>
+              <w:rPr>
+                <w:rFonts w:ascii="Calibri" w:hAnsi="Calibri"/>
+                <w:sz w:val="18"/>
+              </w:rPr>
+              <w:t>Some FX or conversion risk in the payment path</w:t>
+            </w:r>
+          </w:p>
+        </w:tc>
+        <w:tc>
+          <w:tcPr>
+            <w:tcW w:w="2386" w:type="dxa"/>
+            <w:shd w:val="clear" w:color="auto" w:fill="E2EFDA"/>
+            <w:tcMar>
+              <w:top w:w="80" w:type="dxa"/>
+              <w:left w:w="120" w:type="dxa"/>
+              <w:bottom w:w="80" w:type="dxa"/>
+              <w:right w:w="120" w:type="dxa"/>
+            </w:tcMar>
+          </w:tcPr>
+          <w:p>
+            <w:r>
+              <w:rPr>
+                <w:rFonts w:ascii="Calibri" w:hAnsi="Calibri"/>
+                <w:sz w:val="18"/>
+              </w:rPr>
+              <w:t>Direct to bondholder/trustee, or a pre-funded escrow</w:t>
+            </w:r>
+          </w:p>
+        </w:tc>
+      </w:tr>
+      <w:tr>
+        <w:trPr>
+          <w:cantSplit/>
+        </w:trPr>
+        <w:tc>
+          <w:tcPr>
+            <w:tcW w:w="2200" w:type="dxa"/>
+            <w:tcMar>
+              <w:top w:w="80" w:type="dxa"/>
+              <w:left w:w="120" w:type="dxa"/>
+              <w:bottom w:w="80" w:type="dxa"/>
+              <w:right w:w="120" w:type="dxa"/>
+            </w:tcMar>
+          </w:tcPr>
+          <w:p>
+            <w:r>
+              <w:rPr>
+                <w:rFonts w:ascii="Calibri" w:hAnsi="Calibri"/>
+                <w:b/>
+                <w:sz w:val="18"/>
+              </w:rPr>
+              <w:t>6. Guarantor identity &amp; quality</w:t>
+            </w:r>
+          </w:p>
+        </w:tc>
+        <w:tc>
+          <w:tcPr>
+            <w:tcW w:w="2387" w:type="dxa"/>
+            <w:shd w:val="clear" w:color="auto" w:fill="FCE4E4"/>
+            <w:tcMar>
+              <w:top w:w="80" w:type="dxa"/>
+              <w:left w:w="120" w:type="dxa"/>
+              <w:bottom w:w="80" w:type="dxa"/>
+              <w:right w:w="120" w:type="dxa"/>
+            </w:tcMar>
+          </w:tcPr>
+          <w:p>
+            <w:r>
+              <w:rPr>
+                <w:rFonts w:ascii="Calibri" w:hAnsi="Calibri"/>
+                <w:sz w:val="18"/>
+              </w:rPr>
+              <w:t>No genuinely independent external guarantor</w:t>
+            </w:r>
+          </w:p>
+        </w:tc>
+        <w:tc>
+          <w:tcPr>
+            <w:tcW w:w="2387" w:type="dxa"/>
+            <w:shd w:val="clear" w:color="auto" w:fill="FFF2CC"/>
+            <w:tcMar>
+              <w:top w:w="80" w:type="dxa"/>
+              <w:left w:w="120" w:type="dxa"/>
+              <w:bottom w:w="80" w:type="dxa"/>
+              <w:right w:w="120" w:type="dxa"/>
+            </w:tcMar>
+          </w:tcPr>
+          <w:p>
+            <w:r>
+              <w:rPr>
+                <w:rFonts w:ascii="Calibri" w:hAnsi="Calibri"/>
+                <w:sz w:val="18"/>
+              </w:rPr>
+              <w:t>Independent, but rated below AA</w:t>
+            </w:r>
+          </w:p>
+        </w:tc>
+        <w:tc>
+          <w:tcPr>
+            <w:tcW w:w="2386" w:type="dxa"/>
+            <w:shd w:val="clear" w:color="auto" w:fill="E2EFDA"/>
+            <w:tcMar>
+              <w:top w:w="80" w:type="dxa"/>
+              <w:left w:w="120" w:type="dxa"/>
+              <w:bottom w:w="80" w:type="dxa"/>
+              <w:right w:w="120" w:type="dxa"/>
+            </w:tcMar>
+          </w:tcPr>
+          <w:p>
+            <w:r>
+              <w:rPr>
+                <w:rFonts w:ascii="Calibri" w:hAnsi="Calibri"/>
+                <w:sz w:val="18"/>
+              </w:rPr>
+              <w:t>AA+ or better, ideally multilateral with preferred creditor status</w:t>
+            </w:r>
+          </w:p>
+        </w:tc>
+      </w:tr>
+      <w:tr>
+        <w:trPr>
+          <w:cantSplit/>
+        </w:trPr>
+        <w:tc>
+          <w:tcPr>
+            <w:tcW w:w="2200" w:type="dxa"/>
+            <w:tcMar>
+              <w:top w:w="80" w:type="dxa"/>
+              <w:left w:w="120" w:type="dxa"/>
+              <w:bottom w:w="80" w:type="dxa"/>
+              <w:right w:w="120" w:type="dxa"/>
+            </w:tcMar>
+          </w:tcPr>
+          <w:p>
+            <w:r>
+              <w:rPr>
+                <w:rFonts w:ascii="Calibri" w:hAnsi="Calibri"/>
+                <w:b/>
+                <w:sz w:val="18"/>
+              </w:rPr>
+              <w:t>7. Rating agency treatment</w:t>
+            </w:r>
+          </w:p>
+        </w:tc>
+        <w:tc>
+          <w:tcPr>
+            <w:tcW w:w="2387" w:type="dxa"/>
+            <w:shd w:val="clear" w:color="auto" w:fill="FCE4E4"/>
+            <w:tcMar>
+              <w:top w:w="80" w:type="dxa"/>
+              <w:left w:w="120" w:type="dxa"/>
+              <w:bottom w:w="80" w:type="dxa"/>
+              <w:right w:w="120" w:type="dxa"/>
+            </w:tcMar>
+          </w:tcPr>
+          <w:p>
+            <w:r>
+              <w:rPr>
+                <w:rFonts w:ascii="Calibri" w:hAnsi="Calibri"/>
+                <w:sz w:val="18"/>
+              </w:rPr>
+              <w:t>No separate rating action from the issuer</w:t>
+            </w:r>
+          </w:p>
+        </w:tc>
+        <w:tc>
+          <w:tcPr>
+            <w:tcW w:w="2387" w:type="dxa"/>
+            <w:shd w:val="clear" w:color="auto" w:fill="FFF2CC"/>
+            <w:tcMar>
+              <w:top w:w="80" w:type="dxa"/>
+              <w:left w:w="120" w:type="dxa"/>
+              <w:bottom w:w="80" w:type="dxa"/>
+              <w:right w:w="120" w:type="dxa"/>
+            </w:tcMar>
+          </w:tcPr>
+          <w:p>
+            <w:r>
+              <w:rPr>
+                <w:rFonts w:ascii="Calibri" w:hAnsi="Calibri"/>
+                <w:sz w:val="18"/>
+              </w:rPr>
+              <w:t>Rated separately, but uplift rationale not clearly disclosed</w:t>
+            </w:r>
+          </w:p>
+        </w:tc>
+        <w:tc>
+          <w:tcPr>
+            <w:tcW w:w="2386" w:type="dxa"/>
+            <w:shd w:val="clear" w:color="auto" w:fill="E2EFDA"/>
+            <w:tcMar>
+              <w:top w:w="80" w:type="dxa"/>
+              <w:left w:w="120" w:type="dxa"/>
+              <w:bottom w:w="80" w:type="dxa"/>
+              <w:right w:w="120" w:type="dxa"/>
+            </w:tcMar>
+          </w:tcPr>
+          <w:p>
+            <w:r>
+              <w:rPr>
+                <w:rFonts w:ascii="Calibri" w:hAnsi="Calibri"/>
+                <w:sz w:val="18"/>
+              </w:rPr>
+              <w:t>Rated separately with explicit, quantified PD/LGD uplift</w:t>
+            </w:r>
+          </w:p>
+        </w:tc>
+      </w:tr>
+      <w:tr>
+        <w:trPr>
+          <w:cantSplit/>
+        </w:trPr>
+        <w:tc>
+          <w:tcPr>
+            <w:tcW w:w="2200" w:type="dxa"/>
+            <w:tcMar>
+              <w:top w:w="80" w:type="dxa"/>
+              <w:left w:w="120" w:type="dxa"/>
+              <w:bottom w:w="80" w:type="dxa"/>
+              <w:right w:w="120" w:type="dxa"/>
+            </w:tcMar>
+          </w:tcPr>
+          <w:p>
+            <w:r>
+              <w:rPr>
+                <w:rFonts w:ascii="Calibri" w:hAnsi="Calibri"/>
+                <w:b/>
+                <w:sz w:val="18"/>
+              </w:rPr>
+              <w:t>8. Ranking &amp; documentation</w:t>
+            </w:r>
+          </w:p>
+        </w:tc>
+        <w:tc>
+          <w:tcPr>
+            <w:tcW w:w="2387" w:type="dxa"/>
+            <w:shd w:val="clear" w:color="auto" w:fill="FCE4E4"/>
+            <w:tcMar>
+              <w:top w:w="80" w:type="dxa"/>
+              <w:left w:w="120" w:type="dxa"/>
+              <w:bottom w:w="80" w:type="dxa"/>
+              <w:right w:w="120" w:type="dxa"/>
+            </w:tcMar>
+          </w:tcPr>
+          <w:p>
+            <w:r>
+              <w:rPr>
+                <w:rFonts w:ascii="Calibri" w:hAnsi="Calibri"/>
+                <w:sz w:val="18"/>
+              </w:rPr>
+              <w:t>Documentation not public; ranking unclear</w:t>
+            </w:r>
+          </w:p>
+        </w:tc>
+        <w:tc>
+          <w:tcPr>
+            <w:tcW w:w="2387" w:type="dxa"/>
+            <w:shd w:val="clear" w:color="auto" w:fill="FFF2CC"/>
+            <w:tcMar>
+              <w:top w:w="80" w:type="dxa"/>
+              <w:left w:w="120" w:type="dxa"/>
+              <w:bottom w:w="80" w:type="dxa"/>
+              <w:right w:w="120" w:type="dxa"/>
+            </w:tcMar>
+          </w:tcPr>
+          <w:p>
+            <w:r>
+              <w:rPr>
+                <w:rFonts w:ascii="Calibri" w:hAnsi="Calibri"/>
+                <w:sz w:val="18"/>
+              </w:rPr>
+              <w:t>Partial disclosure via rating agency commentary only</w:t>
+            </w:r>
+          </w:p>
+        </w:tc>
+        <w:tc>
+          <w:tcPr>
+            <w:tcW w:w="2386" w:type="dxa"/>
+            <w:shd w:val="clear" w:color="auto" w:fill="E2EFDA"/>
+            <w:tcMar>
+              <w:top w:w="80" w:type="dxa"/>
+              <w:left w:w="120" w:type="dxa"/>
+              <w:bottom w:w="80" w:type="dxa"/>
+              <w:right w:w="120" w:type="dxa"/>
+            </w:tcMar>
+          </w:tcPr>
+          <w:p>
+            <w:r>
+              <w:rPr>
+                <w:rFonts w:ascii="Calibri" w:hAnsi="Calibri"/>
+                <w:sz w:val="18"/>
+              </w:rPr>
+              <w:t>Fully public; explicit pari passu / preferred ranking language</w:t>
+            </w:r>
+          </w:p>
+        </w:tc>
+      </w:tr>
+      <w:tr>
+        <w:trPr>
+          <w:cantSplit/>
+        </w:trPr>
+        <w:tc>
+          <w:tcPr>
+            <w:tcW w:w="2200" w:type="dxa"/>
+            <w:tcMar>
+              <w:top w:w="80" w:type="dxa"/>
+              <w:left w:w="120" w:type="dxa"/>
+              <w:bottom w:w="80" w:type="dxa"/>
+              <w:right w:w="120" w:type="dxa"/>
+            </w:tcMar>
+          </w:tcPr>
+          <w:p>
+            <w:r>
+              <w:rPr>
+                <w:rFonts w:ascii="Calibri" w:hAnsi="Calibri"/>
+                <w:b/>
+                <w:sz w:val="18"/>
+              </w:rPr>
+              <w:lastRenderedPageBreak/>
+              <w:t>9. Restructuring treatment</w:t>
+            </w:r>
+          </w:p>
+        </w:tc>
+        <w:tc>
+          <w:tcPr>
+            <w:tcW w:w="2387" w:type="dxa"/>
+            <w:shd w:val="clear" w:color="auto" w:fill="FCE4E4"/>
+            <w:tcMar>
+              <w:top w:w="80" w:type="dxa"/>
+              <w:left w:w="120" w:type="dxa"/>
+              <w:bottom w:w="80" w:type="dxa"/>
+              <w:right w:w="120" w:type="dxa"/>
+            </w:tcMar>
+          </w:tcPr>
+          <w:p>
+            <w:r>
+              <w:rPr>
+                <w:rFonts w:ascii="Calibri" w:hAnsi="Calibri"/>
+                <w:sz w:val="18"/>
+              </w:rPr>
+              <w:t>No carve-out language; precedent suggests inclusion in perimeter</w:t>
+            </w:r>
+          </w:p>
+        </w:tc>
+        <w:tc>
+          <w:tcPr>
+            <w:tcW w:w="2387" w:type="dxa"/>
+            <w:shd w:val="clear" w:color="auto" w:fill="FFF2CC"/>
+            <w:tcMar>
+              <w:top w:w="80" w:type="dxa"/>
+              <w:left w:w="120" w:type="dxa"/>
+              <w:bottom w:w="80" w:type="dxa"/>
+              <w:right w:w="120" w:type="dxa"/>
+            </w:tcMar>
+          </w:tcPr>
+          <w:p>
+            <w:r>
+              <w:rPr>
+                <w:rFonts w:ascii="Calibri" w:hAnsi="Calibri"/>
+                <w:sz w:val="18"/>
+              </w:rPr>
+              <w:t>Untested, no clear DSA or programme treatment either way</w:t>
+            </w:r>
+          </w:p>
+        </w:tc>
+        <w:tc>
+          <w:tcPr>
+            <w:tcW w:w="2386" w:type="dxa"/>
+            <w:shd w:val="clear" w:color="auto" w:fill="E2EFDA"/>
+            <w:tcMar>
+              <w:top w:w="80" w:type="dxa"/>
+              <w:left w:w="120" w:type="dxa"/>
+              <w:bottom w:w="80" w:type="dxa"/>
+              <w:right w:w="120" w:type="dxa"/>
+            </w:tcMar>
+          </w:tcPr>
+          <w:p>
+            <w:r>
+              <w:rPr>
+                <w:rFonts w:ascii="Calibri" w:hAnsi="Calibri"/>
+                <w:sz w:val="18"/>
+              </w:rPr>
+              <w:t>Explicit carve-out, and/or DSA-confirmed treatment</w:t>
+            </w:r>
+          </w:p>
+        </w:tc>
+      </w:tr>
+    </w:tbl>
+    <w:p>
+      <w:pPr>
+        <w:spacing w:before="160" w:after="200" w:line="276" w:lineRule="auto"/>
+      </w:pPr>
+      <w:r>
+        <w:rPr>
+          <w:rFonts w:ascii="Calibri" w:eastAsia="Calibri" w:hAnsi="Calibri" w:cs="Calibri"/>
+          <w:i/>
+          <w:iCs/>
+          <w:color w:val="555555"/>
+        </w:rPr>
+        <w:t>Remember factors 1–3 gate the tier before factors 4, 6, and 7 can lift it, per the aggregation rule set out later in this document.</w:t>
+      </w:r>
+    </w:p>
+    <w:p>
+      <w:pPr>
+        <w:spacing w:after="120" w:line="276" w:lineRule="auto"/>
+      </w:pPr>
+      <w:r>
+        <w:rPr>
+          <w:rFonts w:ascii="Calibri" w:eastAsia="Calibri" w:hAnsi="Calibri" w:cs="Calibri"/>
+          <w:b/>
+          <w:bCs/>
+          <w:i/>
+          <w:iCs/>
+          <w:color w:val="B22222"/>
+          <w:sz w:val="22"/>
+          <w:szCs w:val="22"/>
+        </w:rPr>
+        <w:t xml:space="preserve">Poor – Egypt example (historical): </w:t>
+      </w:r>
+      <w:r>
+        <w:rPr>
+          <w:rFonts w:ascii="Calibri" w:eastAsia="Calibri" w:hAnsi="Calibri" w:cs="Calibri"/>
+          <w:i/>
+          <w:iCs/>
+          <w:sz w:val="22"/>
+          <w:szCs w:val="22"/>
+        </w:rPr>
+        <w:t>EGPC’s arrears to international oil companies, which peaked near $6.1–6.2bn in mid-2024, illustrate implicit backing failing to translate into enforceable protection under stress – there was no bond structure or guarantee instrument giving creditors direct recourse to the sovereign, only diplomatic and investment-climate pressure. Egypt’s Ministry of Petroleum announced these arrears fully cleared as of 10 June 2026, so this is now a resolved case rather than a live exposure, but the mechanics remain the clearest real-world illustration of this tier.</w:t>
+      </w:r>
+    </w:p>
+    <w:p>
+      <w:pPr>
+        <w:spacing w:after="120" w:line="276" w:lineRule="auto"/>
+      </w:pPr>
+      <w:r>
+        <w:rPr>
+          <w:rFonts w:ascii="Calibri" w:eastAsia="Calibri" w:hAnsi="Calibri" w:cs="Calibri"/>
+          <w:b/>
+          <w:bCs/>
+          <w:i/>
+          <w:iCs/>
+          <w:color w:val="B7791F"/>
+          <w:sz w:val="22"/>
+          <w:szCs w:val="22"/>
+        </w:rPr>
+        <w:t xml:space="preserve">Moderate – no clean example: </w:t>
+      </w:r>
+      <w:r>
+        <w:rPr>
+          <w:rFonts w:ascii="Calibri" w:eastAsia="Calibri" w:hAnsi="Calibri" w:cs="Calibri"/>
+          <w:i/>
+          <w:iCs/>
+          <w:sz w:val="22"/>
+          <w:szCs w:val="22"/>
+        </w:rPr>
+        <w:t>most Egyptian foreign-currency SOE issuance sits at either the poor end (no explicit guarantee) or the strong end (fully structured multilateral PCG); there isn’t a well-documented public case sitting squarely in the middle. A locally-governed guarantee with a payment-of-collection standard would illustrate this tier, but no real Egyptian instrument fits cleanly enough to name.</w:t>
+      </w:r>
+    </w:p>
+    <w:p>
+      <w:pPr>
+        <w:spacing w:after="200" w:line="276" w:lineRule="auto"/>
+      </w:pPr>
+      <w:r>
+        <w:rPr>
+          <w:rFonts w:ascii="Calibri" w:eastAsia="Calibri" w:hAnsi="Calibri" w:cs="Calibri"/>
+          <w:b/>
+          <w:bCs/>
+          <w:i/>
+          <w:iCs/>
+          <w:color w:val="2E7D32"/>
+          <w:sz w:val="22"/>
+          <w:szCs w:val="22"/>
+        </w:rPr>
+        <w:t xml:space="preserve">Strong – Egypt example: </w:t>
+      </w:r>
+      <w:r>
+        <w:rPr>
+          <w:rFonts w:ascii="Calibri" w:eastAsia="Calibri" w:hAnsi="Calibri" w:cs="Calibri"/>
+          <w:i/>
+          <w:iCs/>
+          <w:sz w:val="22"/>
+          <w:szCs w:val="22"/>
+        </w:rPr>
+        <w:t>the AfDB-backed sustainability samurai bond carries an explicit partial credit guarantee from a AAA-rated multilateral, a foreign-governed structure, and a direct payment mechanism, resulting in AA+/AA tranche ratings – strong mechanics, though only partial substitution given the guarantee’s scope (see the caveat at the end of the “Applying the scale” section).</w:t>
+      </w:r>
+    </w:p>
+    <w:p>
+      <w:pPr>
+        <w:pStyle w:val="Heading1"/>
+        <w:spacing w:before="360" w:after="160"/>
+      </w:pPr>
+      <w:r>
+        <w:rPr>
+          <w:rFonts w:ascii="Calibri" w:eastAsia="Calibri" w:hAnsi="Calibri" w:cs="Calibri"/>
+          <w:b/>
+          <w:bCs/>
+          <w:color w:val="1F3864"/>
+          <w:sz w:val="26"/>
+          <w:szCs w:val="26"/>
+        </w:rPr>
         <w:t>The checklist: what determines guarantee quality</w:t>
       </w:r>
     </w:p>
@@ -128,43 +1124,7 @@
           <w:sz w:val="22"/>
           <w:szCs w:val="22"/>
         </w:rPr>
-        <w:t xml:space="preserve">A rating or a headline “government guaranteed” label tells you almost nothing on its own. The questions below are what </w:t>
-      </w:r>
-      <w:proofErr w:type="gramStart"/>
-      <w:r>
-        <w:rPr>
-          <w:rFonts w:ascii="Calibri" w:eastAsia="Calibri" w:hAnsi="Calibri" w:cs="Calibri"/>
-          <w:sz w:val="22"/>
-          <w:szCs w:val="22"/>
-        </w:rPr>
-        <w:t>actually determine</w:t>
-      </w:r>
-      <w:proofErr w:type="gramEnd"/>
-      <w:r>
-        <w:rPr>
-          <w:rFonts w:ascii="Calibri" w:eastAsia="Calibri" w:hAnsi="Calibri" w:cs="Calibri"/>
-          <w:sz w:val="22"/>
-          <w:szCs w:val="22"/>
-        </w:rPr>
-        <w:t xml:space="preserve"> whether a guarantee transfers meaningful credit protection to a </w:t>
-      </w:r>
-      <w:proofErr w:type="gramStart"/>
-      <w:r>
-        <w:rPr>
-          <w:rFonts w:ascii="Calibri" w:eastAsia="Calibri" w:hAnsi="Calibri" w:cs="Calibri"/>
-          <w:sz w:val="22"/>
-          <w:szCs w:val="22"/>
-        </w:rPr>
-        <w:t>bondholder, or</w:t>
-      </w:r>
-      <w:proofErr w:type="gramEnd"/>
-      <w:r>
-        <w:rPr>
-          <w:rFonts w:ascii="Calibri" w:eastAsia="Calibri" w:hAnsi="Calibri" w:cs="Calibri"/>
-          <w:sz w:val="22"/>
-          <w:szCs w:val="22"/>
-        </w:rPr>
-        <w:t xml:space="preserve"> just repackages the same risk with a reassuring label attached.</w:t>
+        <w:t>A rating or a headline “government guaranteed” label tells you almost nothing on its own. The questions below are what actually determine whether a guarantee transfers meaningful credit protection to a bondholder, or just repackages the same risk with a reassuring label attached.</w:t>
       </w:r>
     </w:p>
     <w:p>
@@ -232,25 +1192,7 @@
           <w:sz w:val="22"/>
           <w:szCs w:val="22"/>
         </w:rPr>
-        <w:t xml:space="preserve">If explicit: is it a standalone </w:t>
-      </w:r>
-      <w:proofErr w:type="gramStart"/>
-      <w:r>
-        <w:rPr>
-          <w:rFonts w:ascii="Calibri" w:eastAsia="Calibri" w:hAnsi="Calibri" w:cs="Calibri"/>
-          <w:sz w:val="22"/>
-          <w:szCs w:val="22"/>
-        </w:rPr>
-        <w:t>guarantee</w:t>
-      </w:r>
-      <w:proofErr w:type="gramEnd"/>
-      <w:r>
-        <w:rPr>
-          <w:rFonts w:ascii="Calibri" w:eastAsia="Calibri" w:hAnsi="Calibri" w:cs="Calibri"/>
-          <w:sz w:val="22"/>
-          <w:szCs w:val="22"/>
-        </w:rPr>
-        <w:t xml:space="preserve"> agreement, or a clause embedded within the bond’s own terms and conditions? Standalone instruments are generally cleaner and more enforceable.</w:t>
+        <w:t>If explicit: is it a standalone guarantee agreement, or a clause embedded within the bond’s own terms and conditions? Standalone instruments are generally cleaner and more enforceable.</w:t>
       </w:r>
     </w:p>
     <w:p>
@@ -286,6 +1228,7 @@
           <w:sz w:val="22"/>
           <w:szCs w:val="22"/>
         </w:rPr>
+        <w:lastRenderedPageBreak/>
         <w:t>Watch for comfort letters: a soft, non-binding middle ground some governments issue that reads like support but creates no enforceable payment obligation. These get mistaken for real guarantees constantly.</w:t>
       </w:r>
     </w:p>
@@ -336,7 +1279,7 @@
           <w:sz w:val="22"/>
           <w:szCs w:val="22"/>
         </w:rPr>
-        <w:t>Egyptian General Petroleum Corporation’s (EGPC) arrears to international oil companies illustrate implicit backing failing under stress. There is no bond structure or formal guarantee instrument here, but it is the cleanest real-world case of state ownership being assumed to imply support, with no contractual claim giving creditors direct recourse to the sovereign when payment discipline slipped.</w:t>
+        <w:t>Egyptian General Petroleum Corporation’s (EGPC) arrears to international oil companies, which peaked near $6.1–6.2bn in mid-2024 and were fully cleared by the Ministry of Petroleum as of 10 June 2026, illustrate implicit backing failing to translate into enforceable protection while the arrears stood. There was no bond structure or formal guarantee instrument here, but it remains the cleanest real-world case of state ownership being assumed to imply support, with no contractual claim giving creditors direct recourse to the sovereign when payment discipline slipped – resolution came through a coordinated government repayment effort, not through any enforceable guarantee.</w:t>
       </w:r>
     </w:p>
     <w:p>
@@ -353,177 +1296,185 @@
           <w:sz w:val="24"/>
           <w:szCs w:val="24"/>
         </w:rPr>
+        <w:t>2. Governing law</w:t>
+      </w:r>
+    </w:p>
+    <w:p>
+      <w:pPr>
+        <w:spacing w:after="120"/>
+      </w:pPr>
+      <w:r>
+        <w:rPr>
+          <w:rFonts w:ascii="Calibri" w:eastAsia="Calibri" w:hAnsi="Calibri" w:cs="Calibri"/>
+          <w:b/>
+          <w:bCs/>
+          <w:sz w:val="22"/>
+          <w:szCs w:val="22"/>
+        </w:rPr>
+        <w:t>What to check</w:t>
+      </w:r>
+    </w:p>
+    <w:p>
+      <w:pPr>
+        <w:pStyle w:val="ListParagraph"/>
+        <w:numPr>
+          <w:ilvl w:val="0"/>
+          <w:numId w:val="2"/>
+        </w:numPr>
+        <w:spacing w:after="100" w:line="276" w:lineRule="auto"/>
+      </w:pPr>
+      <w:r>
+        <w:rPr>
+          <w:rFonts w:ascii="Calibri" w:eastAsia="Calibri" w:hAnsi="Calibri" w:cs="Calibri"/>
+          <w:sz w:val="22"/>
+          <w:szCs w:val="22"/>
+        </w:rPr>
+        <w:t>Local law vs foreign law (typically English or New York law).</w:t>
+      </w:r>
+    </w:p>
+    <w:p>
+      <w:pPr>
+        <w:pStyle w:val="ListParagraph"/>
+        <w:numPr>
+          <w:ilvl w:val="0"/>
+          <w:numId w:val="2"/>
+        </w:numPr>
+        <w:spacing w:after="100" w:line="276" w:lineRule="auto"/>
+      </w:pPr>
+      <w:r>
+        <w:rPr>
+          <w:rFonts w:ascii="Calibri" w:eastAsia="Calibri" w:hAnsi="Calibri" w:cs="Calibri"/>
+          <w:sz w:val="22"/>
+          <w:szCs w:val="22"/>
+        </w:rPr>
+        <w:t>Under local law, the guarantor government can legislate around its own obligations: restructuring laws, payment moratoria, or capital controls can be passed unilaterally and applied retroactively to domestically governed instruments. The guarantor is also the legislator.</w:t>
+      </w:r>
+    </w:p>
+    <w:p>
+      <w:pPr>
+        <w:pStyle w:val="ListParagraph"/>
+        <w:numPr>
+          <w:ilvl w:val="0"/>
+          <w:numId w:val="2"/>
+        </w:numPr>
+        <w:spacing w:after="100" w:line="276" w:lineRule="auto"/>
+      </w:pPr>
+      <w:r>
+        <w:rPr>
+          <w:rFonts w:ascii="Calibri" w:eastAsia="Calibri" w:hAnsi="Calibri" w:cs="Calibri"/>
+          <w:sz w:val="22"/>
+          <w:szCs w:val="22"/>
+        </w:rPr>
+        <w:t>Under foreign law, the government has contractually submitted to an external legal system it cannot unilaterally rewrite. Disputes are resolved in foreign courts or through arbitration (LCIA, ICC, ICSID), not domestic courts that are ultimately arms of the same government being sued.</w:t>
+      </w:r>
+    </w:p>
+    <w:p>
+      <w:pPr>
+        <w:pStyle w:val="ListParagraph"/>
+        <w:numPr>
+          <w:ilvl w:val="0"/>
+          <w:numId w:val="2"/>
+        </w:numPr>
+        <w:spacing w:after="100" w:line="276" w:lineRule="auto"/>
+      </w:pPr>
+      <w:r>
+        <w:rPr>
+          <w:rFonts w:ascii="Calibri" w:eastAsia="Calibri" w:hAnsi="Calibri" w:cs="Calibri"/>
+          <w:sz w:val="22"/>
+          <w:szCs w:val="22"/>
+        </w:rPr>
+        <w:t>Identify the specific jurisdiction and dispute resolution mechanism named in the documentation. English law with London arbitration is materially stronger than English law with a domestic-court enforcement fallback.</w:t>
+      </w:r>
+    </w:p>
+    <w:p>
+      <w:pPr>
+        <w:spacing w:after="120"/>
+      </w:pPr>
+      <w:r>
+        <w:rPr>
+          <w:rFonts w:ascii="Calibri" w:eastAsia="Calibri" w:hAnsi="Calibri" w:cs="Calibri"/>
+          <w:b/>
+          <w:bCs/>
+          <w:sz w:val="22"/>
+          <w:szCs w:val="22"/>
+        </w:rPr>
+        <w:t>Guarantee of payment vs guarantee of collection: a critical sub-distinction inside governing law</w:t>
+      </w:r>
+    </w:p>
+    <w:p>
+      <w:pPr>
+        <w:pStyle w:val="ListParagraph"/>
+        <w:numPr>
+          <w:ilvl w:val="0"/>
+          <w:numId w:val="2"/>
+        </w:numPr>
+        <w:spacing w:after="100" w:line="276" w:lineRule="auto"/>
+      </w:pPr>
+      <w:r>
+        <w:rPr>
+          <w:rFonts w:ascii="Calibri" w:eastAsia="Calibri" w:hAnsi="Calibri" w:cs="Calibri"/>
+          <w:sz w:val="22"/>
+          <w:szCs w:val="22"/>
+        </w:rPr>
+        <w:t>Guarantee of payment: the creditor can call on the guarantor immediately upon issuer default, with no need to first pursue the issuer through legal process.</w:t>
+      </w:r>
+    </w:p>
+    <w:p>
+      <w:pPr>
+        <w:pStyle w:val="ListParagraph"/>
+        <w:numPr>
+          <w:ilvl w:val="0"/>
+          <w:numId w:val="2"/>
+        </w:numPr>
+        <w:spacing w:after="100" w:line="276" w:lineRule="auto"/>
+      </w:pPr>
+      <w:r>
+        <w:rPr>
+          <w:rFonts w:ascii="Calibri" w:eastAsia="Calibri" w:hAnsi="Calibri" w:cs="Calibri"/>
+          <w:sz w:val="22"/>
+          <w:szCs w:val="22"/>
+        </w:rPr>
+        <w:t>Guarantee of collection: the creditor must first exhaust remedies against the issuer (pursue default or insolvency proceedings) before the guarantor is obligated to pay.</w:t>
+      </w:r>
+    </w:p>
+    <w:p>
+      <w:pPr>
+        <w:pStyle w:val="ListParagraph"/>
+        <w:numPr>
+          <w:ilvl w:val="0"/>
+          <w:numId w:val="2"/>
+        </w:numPr>
+        <w:spacing w:after="100" w:line="276" w:lineRule="auto"/>
+      </w:pPr>
+      <w:r>
+        <w:rPr>
+          <w:rFonts w:ascii="Calibri" w:eastAsia="Calibri" w:hAnsi="Calibri" w:cs="Calibri"/>
+          <w:sz w:val="22"/>
+          <w:szCs w:val="22"/>
+        </w:rPr>
+        <w:t>Related: check whether the enforcement trigger is automatic on a defined event, or only available after litigation and a legal judgment has been obtained. An automatic trigger is materially faster and more reliable than one that requires the creditor to win a case first.</w:t>
+      </w:r>
+    </w:p>
+    <w:p>
+      <w:pPr>
+        <w:spacing w:after="200" w:line="276" w:lineRule="auto"/>
+      </w:pPr>
+      <w:r>
+        <w:rPr>
+          <w:rFonts w:ascii="Calibri" w:eastAsia="Calibri" w:hAnsi="Calibri" w:cs="Calibri"/>
+          <w:sz w:val="22"/>
+          <w:szCs w:val="22"/>
+        </w:rPr>
+        <w:t xml:space="preserve">A guarantee of collection can be explicit and foreign-law governed and still be a weak practical protection, because it delays and dilutes the claim exactly when speed matters most, in a liquidity crisis. </w:t>
+      </w:r>
+      <w:r>
+        <w:rPr>
+          <w:rFonts w:ascii="Calibri" w:eastAsia="Calibri" w:hAnsi="Calibri" w:cs="Calibri"/>
+          <w:sz w:val="22"/>
+          <w:szCs w:val="22"/>
+        </w:rPr>
         <w:lastRenderedPageBreak/>
-        <w:t>2. Governing law</w:t>
-      </w:r>
-    </w:p>
-    <w:p>
-      <w:pPr>
-        <w:spacing w:after="120"/>
-      </w:pPr>
-      <w:r>
-        <w:rPr>
-          <w:rFonts w:ascii="Calibri" w:eastAsia="Calibri" w:hAnsi="Calibri" w:cs="Calibri"/>
-          <w:b/>
-          <w:bCs/>
-          <w:sz w:val="22"/>
-          <w:szCs w:val="22"/>
-        </w:rPr>
-        <w:t>What to check</w:t>
-      </w:r>
-    </w:p>
-    <w:p>
-      <w:pPr>
-        <w:pStyle w:val="ListParagraph"/>
-        <w:numPr>
-          <w:ilvl w:val="0"/>
-          <w:numId w:val="2"/>
-        </w:numPr>
-        <w:spacing w:after="100" w:line="276" w:lineRule="auto"/>
-      </w:pPr>
-      <w:r>
-        <w:rPr>
-          <w:rFonts w:ascii="Calibri" w:eastAsia="Calibri" w:hAnsi="Calibri" w:cs="Calibri"/>
-          <w:sz w:val="22"/>
-          <w:szCs w:val="22"/>
-        </w:rPr>
-        <w:t>Local law vs foreign law (typically English or New York law).</w:t>
-      </w:r>
-    </w:p>
-    <w:p>
-      <w:pPr>
-        <w:pStyle w:val="ListParagraph"/>
-        <w:numPr>
-          <w:ilvl w:val="0"/>
-          <w:numId w:val="2"/>
-        </w:numPr>
-        <w:spacing w:after="100" w:line="276" w:lineRule="auto"/>
-      </w:pPr>
-      <w:r>
-        <w:rPr>
-          <w:rFonts w:ascii="Calibri" w:eastAsia="Calibri" w:hAnsi="Calibri" w:cs="Calibri"/>
-          <w:sz w:val="22"/>
-          <w:szCs w:val="22"/>
-        </w:rPr>
-        <w:t>Under local law, the guarantor government can legislate around its own obligations: restructuring laws, payment moratoria, or capital controls can be passed unilaterally and applied retroactively to domestically governed instruments. The guarantor is also the legislator.</w:t>
-      </w:r>
-    </w:p>
-    <w:p>
-      <w:pPr>
-        <w:pStyle w:val="ListParagraph"/>
-        <w:numPr>
-          <w:ilvl w:val="0"/>
-          <w:numId w:val="2"/>
-        </w:numPr>
-        <w:spacing w:after="100" w:line="276" w:lineRule="auto"/>
-      </w:pPr>
-      <w:r>
-        <w:rPr>
-          <w:rFonts w:ascii="Calibri" w:eastAsia="Calibri" w:hAnsi="Calibri" w:cs="Calibri"/>
-          <w:sz w:val="22"/>
-          <w:szCs w:val="22"/>
-        </w:rPr>
-        <w:t>Under foreign law, the government has contractually submitted to an external legal system it cannot unilaterally rewrite. Disputes are resolved in foreign courts or through arbitration (LCIA, ICC, ICSID), not domestic courts that are ultimately arms of the same government being sued.</w:t>
-      </w:r>
-    </w:p>
-    <w:p>
-      <w:pPr>
-        <w:pStyle w:val="ListParagraph"/>
-        <w:numPr>
-          <w:ilvl w:val="0"/>
-          <w:numId w:val="2"/>
-        </w:numPr>
-        <w:spacing w:after="100" w:line="276" w:lineRule="auto"/>
-      </w:pPr>
-      <w:r>
-        <w:rPr>
-          <w:rFonts w:ascii="Calibri" w:eastAsia="Calibri" w:hAnsi="Calibri" w:cs="Calibri"/>
-          <w:sz w:val="22"/>
-          <w:szCs w:val="22"/>
-        </w:rPr>
-        <w:t>Identify the specific jurisdiction and dispute resolution mechanism named in the documentation. English law with London arbitration is materially stronger than English law with a domestic-court enforcement fallback.</w:t>
-      </w:r>
-    </w:p>
-    <w:p>
-      <w:pPr>
-        <w:spacing w:after="120"/>
-      </w:pPr>
-      <w:r>
-        <w:rPr>
-          <w:rFonts w:ascii="Calibri" w:eastAsia="Calibri" w:hAnsi="Calibri" w:cs="Calibri"/>
-          <w:b/>
-          <w:bCs/>
-          <w:sz w:val="22"/>
-          <w:szCs w:val="22"/>
-        </w:rPr>
-        <w:t>Guarantee of payment vs guarantee of collection: a critical sub-distinction inside governing law</w:t>
-      </w:r>
-    </w:p>
-    <w:p>
-      <w:pPr>
-        <w:pStyle w:val="ListParagraph"/>
-        <w:numPr>
-          <w:ilvl w:val="0"/>
-          <w:numId w:val="2"/>
-        </w:numPr>
-        <w:spacing w:after="100" w:line="276" w:lineRule="auto"/>
-      </w:pPr>
-      <w:r>
-        <w:rPr>
-          <w:rFonts w:ascii="Calibri" w:eastAsia="Calibri" w:hAnsi="Calibri" w:cs="Calibri"/>
-          <w:sz w:val="22"/>
-          <w:szCs w:val="22"/>
-        </w:rPr>
-        <w:t>Guarantee of payment: the creditor can call on the guarantor immediately upon issuer default, with no need to first pursue the issuer through legal process.</w:t>
-      </w:r>
-    </w:p>
-    <w:p>
-      <w:pPr>
-        <w:pStyle w:val="ListParagraph"/>
-        <w:numPr>
-          <w:ilvl w:val="0"/>
-          <w:numId w:val="2"/>
-        </w:numPr>
-        <w:spacing w:after="100" w:line="276" w:lineRule="auto"/>
-      </w:pPr>
-      <w:r>
-        <w:rPr>
-          <w:rFonts w:ascii="Calibri" w:eastAsia="Calibri" w:hAnsi="Calibri" w:cs="Calibri"/>
-          <w:sz w:val="22"/>
-          <w:szCs w:val="22"/>
-        </w:rPr>
-        <w:t>Guarantee of collection: the creditor must first exhaust remedies against the issuer (pursue default or insolvency proceedings) before the guarantor is obligated to pay.</w:t>
-      </w:r>
-    </w:p>
-    <w:p>
-      <w:pPr>
-        <w:pStyle w:val="ListParagraph"/>
-        <w:numPr>
-          <w:ilvl w:val="0"/>
-          <w:numId w:val="2"/>
-        </w:numPr>
-        <w:spacing w:after="100" w:line="276" w:lineRule="auto"/>
-      </w:pPr>
-      <w:r>
-        <w:rPr>
-          <w:rFonts w:ascii="Calibri" w:eastAsia="Calibri" w:hAnsi="Calibri" w:cs="Calibri"/>
-          <w:sz w:val="22"/>
-          <w:szCs w:val="22"/>
-        </w:rPr>
-        <w:t>Related: check whether the enforcement trigger is automatic on a defined event, or only available after litigation and a legal judgment has been obtained. An automatic trigger is materially faster and more reliable than one that requires the creditor to win a case first.</w:t>
-      </w:r>
-    </w:p>
-    <w:p>
-      <w:pPr>
-        <w:spacing w:after="200" w:line="276" w:lineRule="auto"/>
-      </w:pPr>
-      <w:r>
-        <w:rPr>
-          <w:rFonts w:ascii="Calibri" w:eastAsia="Calibri" w:hAnsi="Calibri" w:cs="Calibri"/>
-          <w:sz w:val="22"/>
-          <w:szCs w:val="22"/>
-        </w:rPr>
-        <w:t>A guarantee of collection can be explicit and foreign-law governed and still be a weak practical protection, because it delays and dilutes the claim exactly when speed matters most, in a liquidity crisis. This single drafting choice is one of the most consequential, and most overlooked, details in the entire structure.</w:t>
+        <w:t>This single drafting choice is one of the most consequential, and most overlooked, details in the entire structure.</w:t>
       </w:r>
     </w:p>
     <w:p>
@@ -596,25 +1547,7 @@
           <w:sz w:val="22"/>
           <w:szCs w:val="22"/>
         </w:rPr>
-        <w:t xml:space="preserve">Is there a full waiver of sovereign immunity, both immunity from suit and immunity from execution or attachment of assets, or only a partial waiver (immunity from suit waived, but immunity from execution retained, meaning a creditor can sue but cannot </w:t>
-      </w:r>
-      <w:proofErr w:type="gramStart"/>
-      <w:r>
-        <w:rPr>
-          <w:rFonts w:ascii="Calibri" w:eastAsia="Calibri" w:hAnsi="Calibri" w:cs="Calibri"/>
-          <w:sz w:val="22"/>
-          <w:szCs w:val="22"/>
-        </w:rPr>
-        <w:t>actually seize</w:t>
-      </w:r>
-      <w:proofErr w:type="gramEnd"/>
-      <w:r>
-        <w:rPr>
-          <w:rFonts w:ascii="Calibri" w:eastAsia="Calibri" w:hAnsi="Calibri" w:cs="Calibri"/>
-          <w:sz w:val="22"/>
-          <w:szCs w:val="22"/>
-        </w:rPr>
-        <w:t xml:space="preserve"> anything)?</w:t>
+        <w:t>Is there a full waiver of sovereign immunity, both immunity from suit and immunity from execution or attachment of assets, or only a partial waiver (immunity from suit waived, but immunity from execution retained, meaning a creditor can sue but cannot actually seize anything)?</w:t>
       </w:r>
     </w:p>
     <w:p>
@@ -650,25 +1583,7 @@
           <w:sz w:val="22"/>
           <w:szCs w:val="22"/>
         </w:rPr>
-        <w:t xml:space="preserve">Has this sovereign’s immunity waiver </w:t>
-      </w:r>
-      <w:proofErr w:type="gramStart"/>
-      <w:r>
-        <w:rPr>
-          <w:rFonts w:ascii="Calibri" w:eastAsia="Calibri" w:hAnsi="Calibri" w:cs="Calibri"/>
-          <w:sz w:val="22"/>
-          <w:szCs w:val="22"/>
-        </w:rPr>
-        <w:t>actually been</w:t>
-      </w:r>
-      <w:proofErr w:type="gramEnd"/>
-      <w:r>
-        <w:rPr>
-          <w:rFonts w:ascii="Calibri" w:eastAsia="Calibri" w:hAnsi="Calibri" w:cs="Calibri"/>
-          <w:sz w:val="22"/>
-          <w:szCs w:val="22"/>
-        </w:rPr>
-        <w:t xml:space="preserve"> tested in litigation before? A waiver with case law behind it (the way Argentina’s was tested in NML Capital v. Argentina) carries materially less uncertainty than one that has never been enforced.</w:t>
+        <w:t>Has this sovereign’s immunity waiver actually been tested in litigation before? A waiver with case law behind it (the way Argentina’s was tested in NML Capital v. Argentina) carries materially less uncertainty than one that has never been enforced.</w:t>
       </w:r>
     </w:p>
     <w:p>
@@ -683,7 +1598,6 @@
           <w:sz w:val="22"/>
           <w:szCs w:val="22"/>
         </w:rPr>
-        <w:lastRenderedPageBreak/>
         <w:t xml:space="preserve">Why it matters: </w:t>
       </w:r>
       <w:r>
@@ -692,25 +1606,7 @@
           <w:sz w:val="22"/>
           <w:szCs w:val="22"/>
         </w:rPr>
-        <w:t xml:space="preserve">A guarantee is only as good as a creditor’s ability to </w:t>
-      </w:r>
-      <w:proofErr w:type="gramStart"/>
-      <w:r>
-        <w:rPr>
-          <w:rFonts w:ascii="Calibri" w:eastAsia="Calibri" w:hAnsi="Calibri" w:cs="Calibri"/>
-          <w:sz w:val="22"/>
-          <w:szCs w:val="22"/>
-        </w:rPr>
-        <w:t>actually collect</w:t>
-      </w:r>
-      <w:proofErr w:type="gramEnd"/>
-      <w:r>
-        <w:rPr>
-          <w:rFonts w:ascii="Calibri" w:eastAsia="Calibri" w:hAnsi="Calibri" w:cs="Calibri"/>
-          <w:sz w:val="22"/>
-          <w:szCs w:val="22"/>
-        </w:rPr>
-        <w:t xml:space="preserve"> on it. An unenforceable guarantee against an unwilling sovereign is a moral commitment with legal packaging, not a credit enhancement.</w:t>
+        <w:t>A guarantee is only as good as a creditor’s ability to actually collect on it. An unenforceable guarantee against an unwilling sovereign is a moral commitment with legal packaging, not a credit enhancement.</w:t>
       </w:r>
     </w:p>
     <w:p>
@@ -760,25 +1656,7 @@
           <w:sz w:val="22"/>
           <w:szCs w:val="22"/>
         </w:rPr>
-        <w:t xml:space="preserve">Coverage: principal only, or principal plus coupon? Some structures only </w:t>
-      </w:r>
-      <w:proofErr w:type="gramStart"/>
-      <w:r>
-        <w:rPr>
-          <w:rFonts w:ascii="Calibri" w:eastAsia="Calibri" w:hAnsi="Calibri" w:cs="Calibri"/>
-          <w:sz w:val="22"/>
-          <w:szCs w:val="22"/>
-        </w:rPr>
-        <w:t>guarantee</w:t>
-      </w:r>
-      <w:proofErr w:type="gramEnd"/>
-      <w:r>
-        <w:rPr>
-          <w:rFonts w:ascii="Calibri" w:eastAsia="Calibri" w:hAnsi="Calibri" w:cs="Calibri"/>
-          <w:sz w:val="22"/>
-          <w:szCs w:val="22"/>
-        </w:rPr>
-        <w:t xml:space="preserve"> return of principal at maturity, leaving intermediate coupon payments unprotected, a meaningful gap for any cash-flow-dependent investor.</w:t>
+        <w:t>Coverage: principal only, or principal plus coupon? Some structures only guarantee return of principal at maturity, leaving intermediate coupon payments unprotected, a meaningful gap for any cash-flow-dependent investor.</w:t>
       </w:r>
     </w:p>
     <w:p>
@@ -868,6 +1746,7 @@
           <w:sz w:val="22"/>
           <w:szCs w:val="22"/>
         </w:rPr>
+        <w:lastRenderedPageBreak/>
         <w:t>Specific trigger-only coverage: the guarantee is triggered only by defined events (e.g. non-payment) and may explicitly exclude others, such as restructuring under a multilateral programme.</w:t>
       </w:r>
     </w:p>
@@ -886,43 +1765,7 @@
           <w:sz w:val="22"/>
           <w:szCs w:val="22"/>
         </w:rPr>
-        <w:t xml:space="preserve">Timing of the </w:t>
-      </w:r>
-      <w:proofErr w:type="gramStart"/>
-      <w:r>
-        <w:rPr>
-          <w:rFonts w:ascii="Calibri" w:eastAsia="Calibri" w:hAnsi="Calibri" w:cs="Calibri"/>
-          <w:sz w:val="22"/>
-          <w:szCs w:val="22"/>
-        </w:rPr>
-        <w:t>guarantee</w:t>
-      </w:r>
-      <w:proofErr w:type="gramEnd"/>
-      <w:r>
-        <w:rPr>
-          <w:rFonts w:ascii="Calibri" w:eastAsia="Calibri" w:hAnsi="Calibri" w:cs="Calibri"/>
-          <w:sz w:val="22"/>
-          <w:szCs w:val="22"/>
-        </w:rPr>
-        <w:t xml:space="preserve"> call: is there a defined grace period, and how long does the guarantor have to </w:t>
-      </w:r>
-      <w:proofErr w:type="gramStart"/>
-      <w:r>
-        <w:rPr>
-          <w:rFonts w:ascii="Calibri" w:eastAsia="Calibri" w:hAnsi="Calibri" w:cs="Calibri"/>
-          <w:sz w:val="22"/>
-          <w:szCs w:val="22"/>
-        </w:rPr>
-        <w:t>actually pay</w:t>
-      </w:r>
-      <w:proofErr w:type="gramEnd"/>
-      <w:r>
-        <w:rPr>
-          <w:rFonts w:ascii="Calibri" w:eastAsia="Calibri" w:hAnsi="Calibri" w:cs="Calibri"/>
-          <w:sz w:val="22"/>
-          <w:szCs w:val="22"/>
-        </w:rPr>
-        <w:t xml:space="preserve"> out once called? Even a strong guarantee with a long payment window creates real interim risk.</w:t>
+        <w:t>Timing of the guarantee call: is there a defined grace period, and how long does the guarantor have to actually pay out once called? Even a strong guarantee with a long payment window creates real interim risk.</w:t>
       </w:r>
     </w:p>
     <w:p>
@@ -945,25 +1788,7 @@
           <w:sz w:val="22"/>
           <w:szCs w:val="22"/>
         </w:rPr>
-        <w:t xml:space="preserve">This is where “the guarantee is strong” and “the guarantee removes credit risk” stop being the same statement. A partial credit guarantee mostly compresses loss given default, not probability of default; the underlying issuer’s own credit quality still anchors the analysis, regardless of how well-structured the </w:t>
-      </w:r>
-      <w:proofErr w:type="gramStart"/>
-      <w:r>
-        <w:rPr>
-          <w:rFonts w:ascii="Calibri" w:eastAsia="Calibri" w:hAnsi="Calibri" w:cs="Calibri"/>
-          <w:sz w:val="22"/>
-          <w:szCs w:val="22"/>
-        </w:rPr>
-        <w:t>guarantee</w:t>
-      </w:r>
-      <w:proofErr w:type="gramEnd"/>
-      <w:r>
-        <w:rPr>
-          <w:rFonts w:ascii="Calibri" w:eastAsia="Calibri" w:hAnsi="Calibri" w:cs="Calibri"/>
-          <w:sz w:val="22"/>
-          <w:szCs w:val="22"/>
-        </w:rPr>
-        <w:t xml:space="preserve"> mechanics are.</w:t>
+        <w:t>This is where “the guarantee is strong” and “the guarantee removes credit risk” stop being the same statement. A partial credit guarantee mostly compresses loss given default, not probability of default; the underlying issuer’s own credit quality still anchors the analysis, regardless of how well-structured the guarantee mechanics are.</w:t>
       </w:r>
     </w:p>
     <w:p>
@@ -990,51 +1815,7 @@
           <w:sz w:val="22"/>
           <w:szCs w:val="22"/>
         </w:rPr>
-        <w:t xml:space="preserve">Egypt’s AfDB-backed sustainability samurai bond carries an explicit partial credit guarantee from a AAA-rated multilateral, with tranches rated AA+ and AA </w:t>
-      </w:r>
-      <w:proofErr w:type="gramStart"/>
-      <w:r>
-        <w:rPr>
-          <w:rFonts w:ascii="Calibri" w:eastAsia="Calibri" w:hAnsi="Calibri" w:cs="Calibri"/>
-          <w:i/>
-          <w:iCs/>
-          <w:sz w:val="22"/>
-          <w:szCs w:val="22"/>
-        </w:rPr>
-        <w:t>as a result of</w:t>
-      </w:r>
-      <w:proofErr w:type="gramEnd"/>
-      <w:r>
-        <w:rPr>
-          <w:rFonts w:ascii="Calibri" w:eastAsia="Calibri" w:hAnsi="Calibri" w:cs="Calibri"/>
-          <w:i/>
-          <w:iCs/>
-          <w:sz w:val="22"/>
-          <w:szCs w:val="22"/>
-        </w:rPr>
-        <w:t xml:space="preserve"> the guarantee. The </w:t>
-      </w:r>
-      <w:proofErr w:type="gramStart"/>
-      <w:r>
-        <w:rPr>
-          <w:rFonts w:ascii="Calibri" w:eastAsia="Calibri" w:hAnsi="Calibri" w:cs="Calibri"/>
-          <w:i/>
-          <w:iCs/>
-          <w:sz w:val="22"/>
-          <w:szCs w:val="22"/>
-        </w:rPr>
-        <w:t>guarantee</w:t>
-      </w:r>
-      <w:proofErr w:type="gramEnd"/>
-      <w:r>
-        <w:rPr>
-          <w:rFonts w:ascii="Calibri" w:eastAsia="Calibri" w:hAnsi="Calibri" w:cs="Calibri"/>
-          <w:i/>
-          <w:iCs/>
-          <w:sz w:val="22"/>
-          <w:szCs w:val="22"/>
-        </w:rPr>
-        <w:t xml:space="preserve"> mechanics sit at the strong end of this checklist: foreign-governed structure, credible guarantor, defined coverage. But because the guarantee is partial, the underlying issuer’s own default probability continues to anchor the credit; the AA rating reflects improved expected loss, not full substitution of Egypt’s own risk profile.</w:t>
+        <w:t>Egypt’s AfDB-backed sustainability samurai bond carries an explicit partial credit guarantee from a AAA-rated multilateral, with tranches rated AA+ and AA as a result of the guarantee. The guarantee mechanics sit at the strong end of this checklist: foreign-governed structure, credible guarantor, defined coverage. But because the guarantee is partial, the underlying issuer’s own default probability continues to anchor the credit; the AA rating reflects improved expected loss, not full substitution of Egypt’s own risk profile.</w:t>
       </w:r>
     </w:p>
     <w:p>
@@ -1066,7 +1847,6 @@
           <w:sz w:val="22"/>
           <w:szCs w:val="22"/>
         </w:rPr>
-        <w:lastRenderedPageBreak/>
         <w:t>What to check</w:t>
       </w:r>
     </w:p>
@@ -1212,25 +1992,8 @@
           <w:sz w:val="22"/>
           <w:szCs w:val="22"/>
         </w:rPr>
-        <w:t xml:space="preserve">If the guarantor is multilateral (AfDB, World Bank/IBRD, IFC, US DFC, EIB): check its own senior unsecured rating (typically AAA or AA+), its preferred creditor status (multilaterals are generally repaid ahead of other creditors even in a sovereign restructuring, a real structural strength worth naming explicitly), and its track record of </w:t>
-      </w:r>
-      <w:proofErr w:type="gramStart"/>
-      <w:r>
-        <w:rPr>
-          <w:rFonts w:ascii="Calibri" w:eastAsia="Calibri" w:hAnsi="Calibri" w:cs="Calibri"/>
-          <w:sz w:val="22"/>
-          <w:szCs w:val="22"/>
-        </w:rPr>
-        <w:t>guarantee</w:t>
-      </w:r>
-      <w:proofErr w:type="gramEnd"/>
-      <w:r>
-        <w:rPr>
-          <w:rFonts w:ascii="Calibri" w:eastAsia="Calibri" w:hAnsi="Calibri" w:cs="Calibri"/>
-          <w:sz w:val="22"/>
-          <w:szCs w:val="22"/>
-        </w:rPr>
-        <w:t xml:space="preserve"> products actually being called and honoured.</w:t>
+        <w:lastRenderedPageBreak/>
+        <w:t>If the guarantor is multilateral (AfDB, World Bank/IBRD, IFC, US DFC, EIB): check its own senior unsecured rating (typically AAA or AA+), its preferred creditor status (multilaterals are generally repaid ahead of other creditors even in a sovereign restructuring, a real structural strength worth naming explicitly), and its track record of guarantee products actually being called and honoured.</w:t>
       </w:r>
     </w:p>
     <w:p>
@@ -1271,43 +2034,7 @@
           <w:sz w:val="22"/>
           <w:szCs w:val="22"/>
         </w:rPr>
-        <w:t xml:space="preserve">The entire exercise only enhances credit if it substitutes a stronger credit for a weaker </w:t>
-      </w:r>
-      <w:proofErr w:type="spellStart"/>
-      <w:r>
-        <w:rPr>
-          <w:rFonts w:ascii="Calibri" w:eastAsia="Calibri" w:hAnsi="Calibri" w:cs="Calibri"/>
-          <w:sz w:val="22"/>
-          <w:szCs w:val="22"/>
-        </w:rPr>
-        <w:t>one</w:t>
-      </w:r>
-      <w:proofErr w:type="spellEnd"/>
-      <w:r>
-        <w:rPr>
-          <w:rFonts w:ascii="Calibri" w:eastAsia="Calibri" w:hAnsi="Calibri" w:cs="Calibri"/>
-          <w:sz w:val="22"/>
-          <w:szCs w:val="22"/>
-        </w:rPr>
-        <w:t xml:space="preserve">. A guarantee only helps if the guarantor is genuinely </w:t>
-      </w:r>
-      <w:proofErr w:type="gramStart"/>
-      <w:r>
-        <w:rPr>
-          <w:rFonts w:ascii="Calibri" w:eastAsia="Calibri" w:hAnsi="Calibri" w:cs="Calibri"/>
-          <w:sz w:val="22"/>
-          <w:szCs w:val="22"/>
-        </w:rPr>
-        <w:t>better-rated</w:t>
-      </w:r>
-      <w:proofErr w:type="gramEnd"/>
-      <w:r>
-        <w:rPr>
-          <w:rFonts w:ascii="Calibri" w:eastAsia="Calibri" w:hAnsi="Calibri" w:cs="Calibri"/>
-          <w:sz w:val="22"/>
-          <w:szCs w:val="22"/>
-        </w:rPr>
-        <w:t xml:space="preserve"> and more reliable than the issuer standing alone. This sounds obvious, but it’s the step most often skipped in favour of just reading the headline rating.</w:t>
+        <w:t>The entire exercise only enhances credit if it substitutes a stronger credit for a weaker one. A guarantee only helps if the guarantor is genuinely better-rated and more reliable than the issuer standing alone. This sounds obvious, but it’s the step most often skipped in favour of just reading the headline rating.</w:t>
       </w:r>
     </w:p>
     <w:p>
@@ -1390,7 +2117,6 @@
           <w:sz w:val="22"/>
           <w:szCs w:val="22"/>
         </w:rPr>
-        <w:lastRenderedPageBreak/>
         <w:t xml:space="preserve">Why it matters: </w:t>
       </w:r>
       <w:r>
@@ -1467,25 +2193,7 @@
           <w:sz w:val="22"/>
           <w:szCs w:val="22"/>
         </w:rPr>
-        <w:t xml:space="preserve">Is the </w:t>
-      </w:r>
-      <w:proofErr w:type="gramStart"/>
-      <w:r>
-        <w:rPr>
-          <w:rFonts w:ascii="Calibri" w:eastAsia="Calibri" w:hAnsi="Calibri" w:cs="Calibri"/>
-          <w:sz w:val="22"/>
-          <w:szCs w:val="22"/>
-        </w:rPr>
-        <w:t>guarantee</w:t>
-      </w:r>
-      <w:proofErr w:type="gramEnd"/>
-      <w:r>
-        <w:rPr>
-          <w:rFonts w:ascii="Calibri" w:eastAsia="Calibri" w:hAnsi="Calibri" w:cs="Calibri"/>
-          <w:sz w:val="22"/>
-          <w:szCs w:val="22"/>
-        </w:rPr>
-        <w:t xml:space="preserve"> documentation itself publicly available? In practice it often is not, which is a risk factor in its own right: an investor is frequently relying on summary disclosure or rating agency commentary rather than the underlying legal instrument.</w:t>
+        <w:t>Is the guarantee documentation itself publicly available? In practice it often is not, which is a risk factor in its own right: an investor is frequently relying on summary disclosure or rating agency commentary rather than the underlying legal instrument.</w:t>
       </w:r>
     </w:p>
     <w:p>
@@ -1508,43 +2216,135 @@
           <w:sz w:val="22"/>
           <w:szCs w:val="22"/>
         </w:rPr>
-        <w:t xml:space="preserve">Where full documentation isn’t accessible, the scope and reliability of the government backstop </w:t>
-      </w:r>
-      <w:proofErr w:type="gramStart"/>
-      <w:r>
-        <w:rPr>
-          <w:rFonts w:ascii="Calibri" w:eastAsia="Calibri" w:hAnsi="Calibri" w:cs="Calibri"/>
-          <w:sz w:val="22"/>
-          <w:szCs w:val="22"/>
-        </w:rPr>
-        <w:t>has</w:t>
-      </w:r>
-      <w:proofErr w:type="gramEnd"/>
-      <w:r>
-        <w:rPr>
-          <w:rFonts w:ascii="Calibri" w:eastAsia="Calibri" w:hAnsi="Calibri" w:cs="Calibri"/>
-          <w:sz w:val="22"/>
-          <w:szCs w:val="22"/>
-        </w:rPr>
-        <w:t xml:space="preserve"> to be assessed with less certainty than the headline rating implies. That is itself an input into </w:t>
-      </w:r>
-      <w:proofErr w:type="gramStart"/>
-      <w:r>
-        <w:rPr>
-          <w:rFonts w:ascii="Calibri" w:eastAsia="Calibri" w:hAnsi="Calibri" w:cs="Calibri"/>
-          <w:sz w:val="22"/>
-          <w:szCs w:val="22"/>
-        </w:rPr>
-        <w:t>guarantee</w:t>
-      </w:r>
-      <w:proofErr w:type="gramEnd"/>
-      <w:r>
-        <w:rPr>
-          <w:rFonts w:ascii="Calibri" w:eastAsia="Calibri" w:hAnsi="Calibri" w:cs="Calibri"/>
-          <w:sz w:val="22"/>
-          <w:szCs w:val="22"/>
-        </w:rPr>
-        <w:t xml:space="preserve"> quality, not a footnote to it.</w:t>
+        <w:t>Where full documentation isn’t accessible, the scope and reliability of the government backstop has to be assessed with less certainty than the headline rating implies. That is itself an input into guarantee quality, not a footnote to it.</w:t>
+      </w:r>
+    </w:p>
+    <w:p>
+      <w:pPr>
+        <w:pStyle w:val="Heading2"/>
+        <w:spacing w:before="260" w:after="120"/>
+      </w:pPr>
+      <w:r>
+        <w:rPr>
+          <w:rFonts w:ascii="Calibri" w:eastAsia="Calibri" w:hAnsi="Calibri" w:cs="Calibri"/>
+          <w:b/>
+          <w:bCs/>
+          <w:color w:val="2E5395"/>
+          <w:sz w:val="24"/>
+          <w:szCs w:val="24"/>
+        </w:rPr>
+        <w:t>9. Restructuring treatment</w:t>
+      </w:r>
+    </w:p>
+    <w:p>
+      <w:pPr>
+        <w:spacing w:after="120"/>
+      </w:pPr>
+      <w:r>
+        <w:rPr>
+          <w:rFonts w:ascii="Calibri" w:eastAsia="Calibri" w:hAnsi="Calibri" w:cs="Calibri"/>
+          <w:b/>
+          <w:bCs/>
+          <w:sz w:val="22"/>
+          <w:szCs w:val="22"/>
+        </w:rPr>
+        <w:t>What to check</w:t>
+      </w:r>
+    </w:p>
+    <w:p>
+      <w:pPr>
+        <w:pStyle w:val="ListParagraph"/>
+        <w:numPr>
+          <w:ilvl w:val="0"/>
+          <w:numId w:val="2"/>
+        </w:numPr>
+        <w:spacing w:after="100" w:line="276" w:lineRule="auto"/>
+      </w:pPr>
+      <w:r>
+        <w:rPr>
+          <w:rFonts w:ascii="Calibri" w:eastAsia="Calibri" w:hAnsi="Calibri" w:cs="Calibri"/>
+          <w:sz w:val="22"/>
+          <w:szCs w:val="22"/>
+        </w:rPr>
+        <w:lastRenderedPageBreak/>
+        <w:t>Is the guaranteed instrument explicitly carved out of, or explicitly included within, the perimeter of any future sovereign debt restructuring, whether negotiated bilaterally, under the G20 Common Framework, or through a Paris Club-style process? Guarantee documentation frequently doesn’t address this at all, and the absence of language is itself informative, not neutral.</w:t>
+      </w:r>
+    </w:p>
+    <w:p>
+      <w:pPr>
+        <w:pStyle w:val="ListParagraph"/>
+        <w:numPr>
+          <w:ilvl w:val="0"/>
+          <w:numId w:val="2"/>
+        </w:numPr>
+        <w:spacing w:after="100" w:line="276" w:lineRule="auto"/>
+      </w:pPr>
+      <w:r>
+        <w:rPr>
+          <w:rFonts w:ascii="Calibri" w:eastAsia="Calibri" w:hAnsi="Calibri" w:cs="Calibri"/>
+          <w:sz w:val="22"/>
+          <w:szCs w:val="22"/>
+        </w:rPr>
+        <w:t>If the guarantor is a multilateral, does its preferred creditor status (see #6) actually hold up in this sovereign’s specific restructuring history and current programme design, or is it a market convention being assumed rather than a tested feature of this case?</w:t>
+      </w:r>
+    </w:p>
+    <w:p>
+      <w:pPr>
+        <w:pStyle w:val="ListParagraph"/>
+        <w:numPr>
+          <w:ilvl w:val="0"/>
+          <w:numId w:val="2"/>
+        </w:numPr>
+        <w:spacing w:after="100" w:line="276" w:lineRule="auto"/>
+      </w:pPr>
+      <w:r>
+        <w:rPr>
+          <w:rFonts w:ascii="Calibri" w:eastAsia="Calibri" w:hAnsi="Calibri" w:cs="Calibri"/>
+          <w:sz w:val="22"/>
+          <w:szCs w:val="22"/>
+        </w:rPr>
+        <w:t>Has an IMF-supported programme’s debt sustainability analysis treated this guarantee, or guarantees of this type, as inside or outside the measured public debt stock? Programme documents sometimes state this explicitly, and it is a strong signal of how the guarantee would actually be handled in a restructuring rather than how it is marketed.</w:t>
+      </w:r>
+    </w:p>
+    <w:p>
+      <w:pPr>
+        <w:pStyle w:val="ListParagraph"/>
+        <w:numPr>
+          <w:ilvl w:val="0"/>
+          <w:numId w:val="2"/>
+        </w:numPr>
+        <w:spacing w:after="100" w:line="276" w:lineRule="auto"/>
+      </w:pPr>
+      <w:r>
+        <w:rPr>
+          <w:rFonts w:ascii="Calibri" w:eastAsia="Calibri" w:hAnsi="Calibri" w:cs="Calibri"/>
+          <w:sz w:val="22"/>
+          <w:szCs w:val="22"/>
+        </w:rPr>
+        <w:t>Does this sovereign’s own restructuring precedent, or the lack of one, suggest guaranteed quasi-sovereign paper has historically been carved out or swept in on the same terms as plain sovereign debt?</w:t>
+      </w:r>
+    </w:p>
+    <w:p>
+      <w:pPr>
+        <w:spacing w:after="200" w:line="276" w:lineRule="auto"/>
+      </w:pPr>
+      <w:r>
+        <w:rPr>
+          <w:rFonts w:ascii="Calibri" w:eastAsia="Calibri" w:hAnsi="Calibri" w:cs="Calibri"/>
+          <w:b/>
+          <w:bCs/>
+          <w:sz w:val="22"/>
+          <w:szCs w:val="22"/>
+        </w:rPr>
+        <w:t xml:space="preserve">Why it matters: </w:t>
+      </w:r>
+      <w:r>
+        <w:rPr>
+          <w:rFonts w:ascii="Calibri" w:eastAsia="Calibri" w:hAnsi="Calibri" w:cs="Calibri"/>
+          <w:sz w:val="22"/>
+          <w:szCs w:val="22"/>
+        </w:rPr>
+        <w:t>Every other item on this checklist assesses enforceability against a solvent government choosing not to pay. A restructuring is a different scenario: the government, often alongside its official creditors, is collectively deciding how to reallocate losses across creditor classes rather than simply defaulting. A guarantee that scores strong on mechanics elsewhere on this checklist can still be pulled into that renegotiation if it isn’t explicitly carved out, and multilateral preferred creditor status is a market convention rather than a universal legal guarantee, so its durability should be checked against the specific institution and country rather than assumed. For an issuer under, or approaching, an IMF programme, this is the scenario the rest of the checklist doesn’t reach on its own.</w:t>
       </w:r>
     </w:p>
     <w:p>
@@ -1561,7 +2361,30 @@
           <w:sz w:val="26"/>
           <w:szCs w:val="26"/>
         </w:rPr>
-        <w:t>The scale: poor, moderate, strong</w:t>
+        <w:t>Applying the scale</w:t>
+      </w:r>
+    </w:p>
+    <w:p>
+      <w:pPr>
+        <w:spacing w:after="200" w:line="276" w:lineRule="auto"/>
+      </w:pPr>
+      <w:r>
+        <w:rPr>
+          <w:rFonts w:ascii="Calibri" w:eastAsia="Calibri" w:hAnsi="Calibri" w:cs="Calibri"/>
+          <w:b/>
+          <w:bCs/>
+          <w:sz w:val="22"/>
+          <w:szCs w:val="22"/>
+        </w:rPr>
+        <w:t xml:space="preserve">How the checklist above rolls up into a single tier: </w:t>
+      </w:r>
+      <w:r>
+        <w:rPr>
+          <w:rFonts w:ascii="Calibri" w:eastAsia="Calibri" w:hAnsi="Calibri" w:cs="Calibri"/>
+          <w:sz w:val="22"/>
+          <w:szCs w:val="22"/>
+        </w:rPr>
+        <w:t>this is a weighted judgment call, not a simple count of how many factors score well. Governing law and the guarantee-of-payment-versus-collection distinction (factor 2), together with the immunity waiver (factor 3), are load-bearing: they determine whether the guarantee is enforceable at all. A weak result on either caps the overall placement at moderate, no matter how strong the remaining factors are. Guarantee scope, guarantor identity, and rating agency treatment (factors 4, 6, and 7) determine how much protection a sound legal structure actually delivers, and are what move an instrument from moderate to strong; they cannot rescue a structure that is weak on enforceability. Payment mechanism and documentation transparency (factors 5 and 8) are modifiers that shave confidence off a placement rather than changing the tier outright. Restructuring treatment (factor 9) sits outside this ladder rather than inside it: it does not raise or lower the baseline tier, since it is usually untested until an actual restructuring occurs, but a guarantee that would clearly be swept into a restructuring perimeter should be flagged as a standing caveat regardless of where it otherwise scores. In short: check enforceability first; if it fails, stop there. If it holds, use the delivery factors to decide between moderate and strong, and carry the restructuring question as a separate, permanent flag rather than folding it into the score.</w:t>
       </w:r>
     </w:p>
     <w:p>
@@ -1578,7 +2401,8 @@
           <w:sz w:val="24"/>
           <w:szCs w:val="24"/>
         </w:rPr>
-        <w:t>Poor</w:t>
+        <w:lastRenderedPageBreak/>
+        <w:t>Applying the rule: the AfDB samurai bond, worked</w:t>
       </w:r>
     </w:p>
     <w:p>
@@ -1593,10 +2417,19 @@
       <w:r>
         <w:rPr>
           <w:rFonts w:ascii="Calibri" w:eastAsia="Calibri" w:hAnsi="Calibri" w:cs="Calibri"/>
-          <w:sz w:val="22"/>
-          <w:szCs w:val="22"/>
-        </w:rPr>
-        <w:t>Implicit backing only, inferred from state ownership rather than a signed instrument</w:t>
+          <w:b/>
+          <w:sz w:val="22"/>
+          <w:szCs w:val="22"/>
+        </w:rPr>
+        <w:t xml:space="preserve">Enforceability (factors 1–3): </w:t>
+      </w:r>
+      <w:r>
+        <w:rPr>
+          <w:rFonts w:ascii="Calibri" w:eastAsia="Calibri" w:hAnsi="Calibri" w:cs="Calibri"/>
+          <w:sz w:val="22"/>
+          <w:szCs w:val="22"/>
+        </w:rPr>
+        <w:t>explicit, standalone guarantee; foreign, multilateral-governed structure. This passes cleanly, so the placement is not capped at moderate.</w:t>
       </w:r>
     </w:p>
     <w:p>
@@ -1611,10 +2444,19 @@
       <w:r>
         <w:rPr>
           <w:rFonts w:ascii="Calibri" w:eastAsia="Calibri" w:hAnsi="Calibri" w:cs="Calibri"/>
-          <w:sz w:val="22"/>
-          <w:szCs w:val="22"/>
-        </w:rPr>
-        <w:t>Local law, no immunity waiver</w:t>
+          <w:b/>
+          <w:sz w:val="22"/>
+          <w:szCs w:val="22"/>
+        </w:rPr>
+        <w:t xml:space="preserve">Delivery (factors 4, 6, 7): </w:t>
+      </w:r>
+      <w:r>
+        <w:rPr>
+          <w:rFonts w:ascii="Calibri" w:eastAsia="Calibri" w:hAnsi="Calibri" w:cs="Calibri"/>
+          <w:sz w:val="22"/>
+          <w:szCs w:val="22"/>
+        </w:rPr>
+        <w:t>guarantor identity and rating treatment are both strong – AfDB is AAA-rated with preferred creditor status, and the tranches carry explicit AA+/AA ratings that quantify the uplift. Scope, however, is partial rather than full: this is the one factor that does not clear the strong bar outright.</w:t>
       </w:r>
     </w:p>
     <w:p>
@@ -1629,46 +2471,19 @@
       <w:r>
         <w:rPr>
           <w:rFonts w:ascii="Calibri" w:eastAsia="Calibri" w:hAnsi="Calibri" w:cs="Calibri"/>
-          <w:sz w:val="22"/>
-          <w:szCs w:val="22"/>
-        </w:rPr>
-        <w:t>Guarantee of collection where any formal guarantee exists at all</w:t>
-      </w:r>
-    </w:p>
-    <w:p>
-      <w:pPr>
-        <w:pStyle w:val="ListParagraph"/>
-        <w:numPr>
-          <w:ilvl w:val="0"/>
-          <w:numId w:val="2"/>
-        </w:numPr>
-        <w:spacing w:after="100" w:line="276" w:lineRule="auto"/>
-      </w:pPr>
-      <w:r>
-        <w:rPr>
-          <w:rFonts w:ascii="Calibri" w:eastAsia="Calibri" w:hAnsi="Calibri" w:cs="Calibri"/>
-          <w:sz w:val="22"/>
-          <w:szCs w:val="22"/>
-        </w:rPr>
-        <w:t>Payment routed through a domestic ministry or agency</w:t>
-      </w:r>
-    </w:p>
-    <w:p>
-      <w:pPr>
-        <w:pStyle w:val="ListParagraph"/>
-        <w:numPr>
-          <w:ilvl w:val="0"/>
-          <w:numId w:val="2"/>
-        </w:numPr>
-        <w:spacing w:after="100" w:line="276" w:lineRule="auto"/>
-      </w:pPr>
-      <w:r>
-        <w:rPr>
-          <w:rFonts w:ascii="Calibri" w:eastAsia="Calibri" w:hAnsi="Calibri" w:cs="Calibri"/>
-          <w:sz w:val="22"/>
-          <w:szCs w:val="22"/>
-        </w:rPr>
-        <w:t>Same currency as the issuer, no external guarantor involved</w:t>
+          <w:b/>
+          <w:sz w:val="22"/>
+          <w:szCs w:val="22"/>
+        </w:rPr>
+        <w:t xml:space="preserve">Modifiers and restructuring flag (factors 5, 8, 9): </w:t>
+      </w:r>
+      <w:r>
+        <w:rPr>
+          <w:rFonts w:ascii="Calibri" w:eastAsia="Calibri" w:hAnsi="Calibri" w:cs="Calibri"/>
+          <w:sz w:val="22"/>
+          <w:szCs w:val="22"/>
+        </w:rPr>
+        <w:t>payment mechanism and full documentation availability are not confirmed from public sources alone and should be verified directly against the guarantee agreement before finalizing a score. Restructuring treatment is an open flag rather than a scored input: nothing in the public structure explicitly addresses how this guarantee would be treated inside an Egyptian sovereign restructuring, so it carries forward as a caveat regardless of the tier reached below.</w:t>
       </w:r>
     </w:p>
     <w:p>
@@ -1680,295 +2495,18 @@
           <w:rFonts w:ascii="Calibri" w:eastAsia="Calibri" w:hAnsi="Calibri" w:cs="Calibri"/>
           <w:b/>
           <w:bCs/>
-          <w:i/>
-          <w:iCs/>
-          <w:sz w:val="22"/>
-          <w:szCs w:val="22"/>
-        </w:rPr>
-        <w:t xml:space="preserve">Egypt example: </w:t>
-      </w:r>
-      <w:r>
-        <w:rPr>
-          <w:rFonts w:ascii="Calibri" w:eastAsia="Calibri" w:hAnsi="Calibri" w:cs="Calibri"/>
-          <w:i/>
-          <w:iCs/>
-          <w:sz w:val="22"/>
-          <w:szCs w:val="22"/>
-        </w:rPr>
-        <w:t>EGPC’s arrears to international oil companies. There is no bond structure, but it is the clearest illustration of implicit sovereign backing failing to translate into enforceable protection under stress.</w:t>
-      </w:r>
-    </w:p>
-    <w:p>
-      <w:pPr>
-        <w:pStyle w:val="Heading2"/>
-        <w:spacing w:before="260" w:after="120"/>
-      </w:pPr>
-      <w:r>
-        <w:rPr>
-          <w:rFonts w:ascii="Calibri" w:eastAsia="Calibri" w:hAnsi="Calibri" w:cs="Calibri"/>
-          <w:b/>
-          <w:bCs/>
-          <w:color w:val="2E5395"/>
-          <w:sz w:val="24"/>
-          <w:szCs w:val="24"/>
-        </w:rPr>
-        <w:t>Moderate</w:t>
-      </w:r>
-    </w:p>
-    <w:p>
-      <w:pPr>
-        <w:pStyle w:val="ListParagraph"/>
-        <w:numPr>
-          <w:ilvl w:val="0"/>
-          <w:numId w:val="2"/>
-        </w:numPr>
-        <w:spacing w:after="100" w:line="276" w:lineRule="auto"/>
-      </w:pPr>
-      <w:r>
-        <w:rPr>
-          <w:rFonts w:ascii="Calibri" w:eastAsia="Calibri" w:hAnsi="Calibri" w:cs="Calibri"/>
-          <w:sz w:val="22"/>
-          <w:szCs w:val="22"/>
-        </w:rPr>
-        <w:t>Explicit but conditional guarantee, triggered only by specific events rather than blanket non-payment coverage</w:t>
-      </w:r>
-    </w:p>
-    <w:p>
-      <w:pPr>
-        <w:pStyle w:val="ListParagraph"/>
-        <w:numPr>
-          <w:ilvl w:val="0"/>
-          <w:numId w:val="2"/>
-        </w:numPr>
-        <w:spacing w:after="100" w:line="276" w:lineRule="auto"/>
-      </w:pPr>
-      <w:r>
-        <w:rPr>
-          <w:rFonts w:ascii="Calibri" w:eastAsia="Calibri" w:hAnsi="Calibri" w:cs="Calibri"/>
-          <w:sz w:val="22"/>
-          <w:szCs w:val="22"/>
-        </w:rPr>
-        <w:t>Local law, with some procedural protections</w:t>
-      </w:r>
-    </w:p>
-    <w:p>
-      <w:pPr>
-        <w:pStyle w:val="ListParagraph"/>
-        <w:numPr>
-          <w:ilvl w:val="0"/>
-          <w:numId w:val="2"/>
-        </w:numPr>
-        <w:spacing w:after="100" w:line="276" w:lineRule="auto"/>
-      </w:pPr>
-      <w:r>
-        <w:rPr>
-          <w:rFonts w:ascii="Calibri" w:eastAsia="Calibri" w:hAnsi="Calibri" w:cs="Calibri"/>
-          <w:sz w:val="22"/>
-          <w:szCs w:val="22"/>
-        </w:rPr>
-        <w:t>Guarantee of payment, but scope limited to principal only, or partial coverage</w:t>
-      </w:r>
-    </w:p>
-    <w:p>
-      <w:pPr>
-        <w:pStyle w:val="ListParagraph"/>
-        <w:numPr>
-          <w:ilvl w:val="0"/>
-          <w:numId w:val="2"/>
-        </w:numPr>
-        <w:spacing w:after="100" w:line="276" w:lineRule="auto"/>
-      </w:pPr>
-      <w:r>
-        <w:rPr>
-          <w:rFonts w:ascii="Calibri" w:eastAsia="Calibri" w:hAnsi="Calibri" w:cs="Calibri"/>
-          <w:sz w:val="22"/>
-          <w:szCs w:val="22"/>
-        </w:rPr>
-        <w:t>Some currency mismatch or conversion risk in the payment mechanism</w:t>
-      </w:r>
-    </w:p>
-    <w:p>
-      <w:pPr>
-        <w:spacing w:after="200" w:line="276" w:lineRule="auto"/>
-      </w:pPr>
-      <w:r>
-        <w:rPr>
-          <w:rFonts w:ascii="Calibri" w:eastAsia="Calibri" w:hAnsi="Calibri" w:cs="Calibri"/>
-          <w:b/>
-          <w:bCs/>
-          <w:i/>
-          <w:iCs/>
-          <w:sz w:val="22"/>
-          <w:szCs w:val="22"/>
-        </w:rPr>
-        <w:lastRenderedPageBreak/>
-        <w:t xml:space="preserve">Note on examples at this tier: </w:t>
-      </w:r>
-      <w:r>
-        <w:rPr>
-          <w:rFonts w:ascii="Calibri" w:eastAsia="Calibri" w:hAnsi="Calibri" w:cs="Calibri"/>
-          <w:i/>
-          <w:iCs/>
-          <w:sz w:val="22"/>
-          <w:szCs w:val="22"/>
-        </w:rPr>
-        <w:t xml:space="preserve">most Egyptian foreign-currency SOE issuance sits at either the poor end (no explicit guarantee) or the strong end (fully structured multilateral PCG). There isn’t a clean, well-documented public case sitting squarely in the middle. A constructed, explicitly labelled hypothetical (a </w:t>
-      </w:r>
-      <w:proofErr w:type="gramStart"/>
-      <w:r>
-        <w:rPr>
-          <w:rFonts w:ascii="Calibri" w:eastAsia="Calibri" w:hAnsi="Calibri" w:cs="Calibri"/>
-          <w:i/>
-          <w:iCs/>
-          <w:sz w:val="22"/>
-          <w:szCs w:val="22"/>
-        </w:rPr>
-        <w:t>locally-governed</w:t>
-      </w:r>
-      <w:proofErr w:type="gramEnd"/>
-      <w:r>
-        <w:rPr>
-          <w:rFonts w:ascii="Calibri" w:eastAsia="Calibri" w:hAnsi="Calibri" w:cs="Calibri"/>
-          <w:i/>
-          <w:iCs/>
-          <w:sz w:val="22"/>
-          <w:szCs w:val="22"/>
-        </w:rPr>
-        <w:t xml:space="preserve"> guarantee with a payment-of-collection standard) illustrates the mechanics honestly without overclaiming a real precedent.</w:t>
-      </w:r>
-    </w:p>
-    <w:p>
-      <w:pPr>
-        <w:pStyle w:val="Heading2"/>
-        <w:spacing w:before="260" w:after="120"/>
-      </w:pPr>
-      <w:r>
-        <w:rPr>
-          <w:rFonts w:ascii="Calibri" w:eastAsia="Calibri" w:hAnsi="Calibri" w:cs="Calibri"/>
-          <w:b/>
-          <w:bCs/>
-          <w:color w:val="2E5395"/>
-          <w:sz w:val="24"/>
-          <w:szCs w:val="24"/>
-        </w:rPr>
-        <w:t>Strong</w:t>
-      </w:r>
-    </w:p>
-    <w:p>
-      <w:pPr>
-        <w:pStyle w:val="ListParagraph"/>
-        <w:numPr>
-          <w:ilvl w:val="0"/>
-          <w:numId w:val="2"/>
-        </w:numPr>
-        <w:spacing w:after="100" w:line="276" w:lineRule="auto"/>
-      </w:pPr>
-      <w:r>
-        <w:rPr>
-          <w:rFonts w:ascii="Calibri" w:eastAsia="Calibri" w:hAnsi="Calibri" w:cs="Calibri"/>
-          <w:sz w:val="22"/>
-          <w:szCs w:val="22"/>
-        </w:rPr>
-        <w:t>Explicit, unconditional, irrevocable</w:t>
-      </w:r>
-    </w:p>
-    <w:p>
-      <w:pPr>
-        <w:pStyle w:val="ListParagraph"/>
-        <w:numPr>
-          <w:ilvl w:val="0"/>
-          <w:numId w:val="2"/>
-        </w:numPr>
-        <w:spacing w:after="100" w:line="276" w:lineRule="auto"/>
-      </w:pPr>
-      <w:r>
-        <w:rPr>
-          <w:rFonts w:ascii="Calibri" w:eastAsia="Calibri" w:hAnsi="Calibri" w:cs="Calibri"/>
-          <w:sz w:val="22"/>
-          <w:szCs w:val="22"/>
-        </w:rPr>
-        <w:t>Foreign law, or a multilateral-governed structure, with a credible immunity waiver</w:t>
-      </w:r>
-    </w:p>
-    <w:p>
-      <w:pPr>
-        <w:pStyle w:val="ListParagraph"/>
-        <w:numPr>
-          <w:ilvl w:val="0"/>
-          <w:numId w:val="2"/>
-        </w:numPr>
-        <w:spacing w:after="100" w:line="276" w:lineRule="auto"/>
-      </w:pPr>
-      <w:r>
-        <w:rPr>
-          <w:rFonts w:ascii="Calibri" w:eastAsia="Calibri" w:hAnsi="Calibri" w:cs="Calibri"/>
-          <w:sz w:val="22"/>
-          <w:szCs w:val="22"/>
-        </w:rPr>
-        <w:t>Guarantee of payment, direct and immediate</w:t>
-      </w:r>
-    </w:p>
-    <w:p>
-      <w:pPr>
-        <w:pStyle w:val="ListParagraph"/>
-        <w:numPr>
-          <w:ilvl w:val="0"/>
-          <w:numId w:val="2"/>
-        </w:numPr>
-        <w:spacing w:after="100" w:line="276" w:lineRule="auto"/>
-      </w:pPr>
-      <w:r>
-        <w:rPr>
-          <w:rFonts w:ascii="Calibri" w:eastAsia="Calibri" w:hAnsi="Calibri" w:cs="Calibri"/>
-          <w:sz w:val="22"/>
-          <w:szCs w:val="22"/>
-        </w:rPr>
-        <w:t>Independently rated guarantor at AA+ or better</w:t>
-      </w:r>
-    </w:p>
-    <w:p>
-      <w:pPr>
-        <w:pStyle w:val="ListParagraph"/>
-        <w:numPr>
-          <w:ilvl w:val="0"/>
-          <w:numId w:val="2"/>
-        </w:numPr>
-        <w:spacing w:after="100" w:line="276" w:lineRule="auto"/>
-      </w:pPr>
-      <w:r>
-        <w:rPr>
-          <w:rFonts w:ascii="Calibri" w:eastAsia="Calibri" w:hAnsi="Calibri" w:cs="Calibri"/>
-          <w:sz w:val="22"/>
-          <w:szCs w:val="22"/>
-        </w:rPr>
-        <w:t>Structured payment mechanism with minimal routing risk</w:t>
-      </w:r>
-    </w:p>
-    <w:p>
-      <w:pPr>
-        <w:spacing w:after="200" w:line="276" w:lineRule="auto"/>
-      </w:pPr>
-      <w:r>
-        <w:rPr>
-          <w:rFonts w:ascii="Calibri" w:eastAsia="Calibri" w:hAnsi="Calibri" w:cs="Calibri"/>
-          <w:b/>
-          <w:bCs/>
-          <w:i/>
-          <w:iCs/>
-          <w:sz w:val="22"/>
-          <w:szCs w:val="22"/>
-        </w:rPr>
-        <w:t xml:space="preserve">Egypt example: </w:t>
-      </w:r>
-      <w:r>
-        <w:rPr>
-          <w:rFonts w:ascii="Calibri" w:eastAsia="Calibri" w:hAnsi="Calibri" w:cs="Calibri"/>
-          <w:i/>
-          <w:iCs/>
-          <w:sz w:val="22"/>
-          <w:szCs w:val="22"/>
-        </w:rPr>
-        <w:t>the AfDB-backed sustainability samurai bond. It carries an explicit partial credit guarantee from a AAA-rated multilateral, a foreign-governed structure, and a direct payment mechanism, resulting in AA+/AA tranche ratings.</w:t>
+          <w:sz w:val="22"/>
+          <w:szCs w:val="22"/>
+        </w:rPr>
+        <w:t xml:space="preserve">Result: </w:t>
+      </w:r>
+      <w:r>
+        <w:rPr>
+          <w:rFonts w:ascii="Calibri" w:eastAsia="Calibri" w:hAnsi="Calibri" w:cs="Calibri"/>
+          <w:sz w:val="22"/>
+          <w:szCs w:val="22"/>
+        </w:rPr>
+        <w:t>strong on enforceability and delivery, which places the guarantee mechanics at the strong end of the scale below – consistent with the placement already given in the “strong” tier and in the companion framework piece. The partial scope means this is strong mechanics achieving partial substitution, not a clean AA-equivalent credit, and the restructuring question remains unresolved and should be tracked as a standing caveat rather than treated as settled by the rating.</w:t>
       </w:r>
     </w:p>
     <w:p>

</xml_diff>